<commit_message>
feat(payment-receipt): update QR handling in PHIẾU THU template and improve placeholder management
</commit_message>
<xml_diff>
--- a/BlueDental.BE/src/BlueDental.HttpApi.Host/wwwroot/templates/PHIẾU THU.docx
+++ b/BlueDental.BE/src/BlueDental.HttpApi.Host/wwwroot/templates/PHIẾU THU.docx
@@ -40,9 +40,9 @@
                 <w:noProof/>
               </w:rPr>
               <w:drawing>
-                <wp:inline distT="0" distB="0" distL="0" distR="0" wp14:anchorId="22BF800E" wp14:editId="370A5427">
-                  <wp:extent cx="1454915" cy="1341775"/>
-                  <wp:effectExtent l="0" t="0" r="0" b="0"/>
+                <wp:inline distT="0" distB="0" distL="0" distR="0" wp14:anchorId="4BFF27C2" wp14:editId="2873507C">
+                  <wp:extent cx="1294463" cy="1193800"/>
+                  <wp:effectExtent l="0" t="0" r="1270" b="6350"/>
                   <wp:docPr id="1999780267" name="Picture 1"/>
                   <wp:cNvGraphicFramePr>
                     <a:graphicFrameLocks xmlns:a="http://schemas.openxmlformats.org/drawingml/2006/main" noChangeAspect="1"/>
@@ -72,7 +72,7 @@
                         <pic:spPr bwMode="auto">
                           <a:xfrm>
                             <a:off x="0" y="0"/>
-                            <a:ext cx="1476158" cy="1361366"/>
+                            <a:ext cx="1321003" cy="1218276"/>
                           </a:xfrm>
                           <a:prstGeom prst="rect">
                             <a:avLst/>
@@ -101,8 +101,8 @@
                 <w:rFonts w:ascii="Times New Roman" w:hAnsi="Times New Roman" w:cs="Times New Roman"/>
                 <w:b/>
                 <w:bCs/>
-                <w:sz w:val="114"/>
-                <w:szCs w:val="114"/>
+                <w:sz w:val="100"/>
+                <w:szCs w:val="100"/>
               </w:rPr>
             </w:pPr>
             <w:r>
@@ -110,8 +110,8 @@
                 <w:rFonts w:ascii="Times New Roman" w:hAnsi="Times New Roman" w:cs="Times New Roman"/>
                 <w:b/>
                 <w:bCs/>
-                <w:sz w:val="114"/>
-                <w:szCs w:val="114"/>
+                <w:sz w:val="100"/>
+                <w:szCs w:val="100"/>
               </w:rPr>
               <w:t>PHIẾU THU</w:t>
             </w:r>
@@ -123,11 +123,61 @@
                 <w:rFonts w:ascii="Times New Roman" w:hAnsi="Times New Roman" w:cs="Times New Roman"/>
               </w:rPr>
             </w:pPr>
-            <w:r>
-              <w:rPr>
-                <w:rFonts w:ascii="Times New Roman" w:hAnsi="Times New Roman" w:cs="Times New Roman"/>
-              </w:rPr>
-              <w:t>Địa chỉ: 84 – 86 Phạm Ngọc Thạch, Phường Xuân Hòa, Tp. Hồ Chí Minh</w:t>
+            <w:proofErr w:type="spellStart"/>
+            <w:r>
+              <w:rPr>
+                <w:rFonts w:ascii="Times New Roman" w:hAnsi="Times New Roman" w:cs="Times New Roman"/>
+              </w:rPr>
+              <w:t>Địa</w:t>
+            </w:r>
+            <w:proofErr w:type="spellEnd"/>
+            <w:r>
+              <w:rPr>
+                <w:rFonts w:ascii="Times New Roman" w:hAnsi="Times New Roman" w:cs="Times New Roman"/>
+              </w:rPr>
+              <w:t xml:space="preserve"> </w:t>
+            </w:r>
+            <w:proofErr w:type="spellStart"/>
+            <w:r>
+              <w:rPr>
+                <w:rFonts w:ascii="Times New Roman" w:hAnsi="Times New Roman" w:cs="Times New Roman"/>
+              </w:rPr>
+              <w:t>chỉ</w:t>
+            </w:r>
+            <w:proofErr w:type="spellEnd"/>
+            <w:r>
+              <w:rPr>
+                <w:rFonts w:ascii="Times New Roman" w:hAnsi="Times New Roman" w:cs="Times New Roman"/>
+              </w:rPr>
+              <w:t xml:space="preserve">: 84 – 86 Phạm Ngọc Thạch, </w:t>
+            </w:r>
+            <w:proofErr w:type="spellStart"/>
+            <w:r>
+              <w:rPr>
+                <w:rFonts w:ascii="Times New Roman" w:hAnsi="Times New Roman" w:cs="Times New Roman"/>
+              </w:rPr>
+              <w:t>Phường</w:t>
+            </w:r>
+            <w:proofErr w:type="spellEnd"/>
+            <w:r>
+              <w:rPr>
+                <w:rFonts w:ascii="Times New Roman" w:hAnsi="Times New Roman" w:cs="Times New Roman"/>
+              </w:rPr>
+              <w:t xml:space="preserve"> Xuân Hòa, Tp. </w:t>
+            </w:r>
+            <w:proofErr w:type="spellStart"/>
+            <w:r>
+              <w:rPr>
+                <w:rFonts w:ascii="Times New Roman" w:hAnsi="Times New Roman" w:cs="Times New Roman"/>
+              </w:rPr>
+              <w:t>Hồ</w:t>
+            </w:r>
+            <w:proofErr w:type="spellEnd"/>
+            <w:r>
+              <w:rPr>
+                <w:rFonts w:ascii="Times New Roman" w:hAnsi="Times New Roman" w:cs="Times New Roman"/>
+              </w:rPr>
+              <w:t xml:space="preserve"> Chí Minh</w:t>
             </w:r>
           </w:p>
           <w:p>
@@ -154,6 +204,8 @@
         </w:tabs>
         <w:rPr>
           <w:rFonts w:ascii="Times New Roman" w:hAnsi="Times New Roman" w:cs="Times New Roman"/>
+          <w:sz w:val="4"/>
+          <w:szCs w:val="4"/>
         </w:rPr>
       </w:pPr>
     </w:p>
@@ -168,19 +220,87 @@
           <w14:ligatures w14:val="none"/>
         </w:rPr>
       </w:pPr>
-      <w:r>
-        <w:rPr>
-          <w:rFonts w:ascii="Times New Roman" w:hAnsi="Times New Roman" w:cs="Times New Roman"/>
-        </w:rPr>
-        <w:t xml:space="preserve">Họ tên khách hàng: </w:t>
-      </w:r>
-      <w:r>
-        <w:rPr>
-          <w:rFonts w:ascii="Times New Roman" w:hAnsi="Times New Roman" w:cs="Times New Roman"/>
-          <w:kern w:val="0"/>
-          <w14:ligatures w14:val="none"/>
-        </w:rPr>
-        <w:t xml:space="preserve">{{CustomerName}} </w:t>
+      <w:proofErr w:type="spellStart"/>
+      <w:r>
+        <w:rPr>
+          <w:rFonts w:ascii="Times New Roman" w:hAnsi="Times New Roman" w:cs="Times New Roman"/>
+        </w:rPr>
+        <w:t>Họ</w:t>
+      </w:r>
+      <w:proofErr w:type="spellEnd"/>
+      <w:r>
+        <w:rPr>
+          <w:rFonts w:ascii="Times New Roman" w:hAnsi="Times New Roman" w:cs="Times New Roman"/>
+        </w:rPr>
+        <w:t xml:space="preserve"> </w:t>
+      </w:r>
+      <w:proofErr w:type="spellStart"/>
+      <w:r>
+        <w:rPr>
+          <w:rFonts w:ascii="Times New Roman" w:hAnsi="Times New Roman" w:cs="Times New Roman"/>
+        </w:rPr>
+        <w:t>tên</w:t>
+      </w:r>
+      <w:proofErr w:type="spellEnd"/>
+      <w:r>
+        <w:rPr>
+          <w:rFonts w:ascii="Times New Roman" w:hAnsi="Times New Roman" w:cs="Times New Roman"/>
+        </w:rPr>
+        <w:t xml:space="preserve"> </w:t>
+      </w:r>
+      <w:proofErr w:type="spellStart"/>
+      <w:r>
+        <w:rPr>
+          <w:rFonts w:ascii="Times New Roman" w:hAnsi="Times New Roman" w:cs="Times New Roman"/>
+        </w:rPr>
+        <w:t>khách</w:t>
+      </w:r>
+      <w:proofErr w:type="spellEnd"/>
+      <w:r>
+        <w:rPr>
+          <w:rFonts w:ascii="Times New Roman" w:hAnsi="Times New Roman" w:cs="Times New Roman"/>
+        </w:rPr>
+        <w:t xml:space="preserve"> </w:t>
+      </w:r>
+      <w:proofErr w:type="spellStart"/>
+      <w:r>
+        <w:rPr>
+          <w:rFonts w:ascii="Times New Roman" w:hAnsi="Times New Roman" w:cs="Times New Roman"/>
+        </w:rPr>
+        <w:t>hàng</w:t>
+      </w:r>
+      <w:proofErr w:type="spellEnd"/>
+      <w:r>
+        <w:rPr>
+          <w:rFonts w:ascii="Times New Roman" w:hAnsi="Times New Roman" w:cs="Times New Roman"/>
+        </w:rPr>
+        <w:t xml:space="preserve">: </w:t>
+      </w:r>
+      <w:r>
+        <w:rPr>
+          <w:rFonts w:ascii="Times New Roman" w:hAnsi="Times New Roman" w:cs="Times New Roman"/>
+          <w:kern w:val="0"/>
+          <w14:ligatures w14:val="none"/>
+        </w:rPr>
+        <w:t>{{</w:t>
+      </w:r>
+      <w:proofErr w:type="spellStart"/>
+      <w:r>
+        <w:rPr>
+          <w:rFonts w:ascii="Times New Roman" w:hAnsi="Times New Roman" w:cs="Times New Roman"/>
+          <w:kern w:val="0"/>
+          <w14:ligatures w14:val="none"/>
+        </w:rPr>
+        <w:t>CustomerName</w:t>
+      </w:r>
+      <w:proofErr w:type="spellEnd"/>
+      <w:r>
+        <w:rPr>
+          <w:rFonts w:ascii="Times New Roman" w:hAnsi="Times New Roman" w:cs="Times New Roman"/>
+          <w:kern w:val="0"/>
+          <w14:ligatures w14:val="none"/>
+        </w:rPr>
+        <w:t>}}</w:t>
       </w:r>
       <w:r>
         <w:rPr>
@@ -208,15 +328,79 @@
           <w:kern w:val="0"/>
           <w14:ligatures w14:val="none"/>
         </w:rPr>
-        <w:t xml:space="preserve">Công việc điều trị: </w:t>
-      </w:r>
-      <w:r>
-        <w:rPr>
-          <w:rFonts w:ascii="Times New Roman" w:hAnsi="Times New Roman" w:cs="Times New Roman"/>
-          <w:kern w:val="0"/>
-          <w14:ligatures w14:val="none"/>
-        </w:rPr>
-        <w:t xml:space="preserve">{{TreatmentWork}} </w:t>
+        <w:t xml:space="preserve">Công </w:t>
+      </w:r>
+      <w:proofErr w:type="spellStart"/>
+      <w:r>
+        <w:rPr>
+          <w:rFonts w:ascii="Times New Roman" w:hAnsi="Times New Roman" w:cs="Times New Roman"/>
+          <w:kern w:val="0"/>
+          <w14:ligatures w14:val="none"/>
+        </w:rPr>
+        <w:t>việc</w:t>
+      </w:r>
+      <w:proofErr w:type="spellEnd"/>
+      <w:r>
+        <w:rPr>
+          <w:rFonts w:ascii="Times New Roman" w:hAnsi="Times New Roman" w:cs="Times New Roman"/>
+          <w:kern w:val="0"/>
+          <w14:ligatures w14:val="none"/>
+        </w:rPr>
+        <w:t xml:space="preserve"> </w:t>
+      </w:r>
+      <w:proofErr w:type="spellStart"/>
+      <w:r>
+        <w:rPr>
+          <w:rFonts w:ascii="Times New Roman" w:hAnsi="Times New Roman" w:cs="Times New Roman"/>
+          <w:kern w:val="0"/>
+          <w14:ligatures w14:val="none"/>
+        </w:rPr>
+        <w:t>điều</w:t>
+      </w:r>
+      <w:proofErr w:type="spellEnd"/>
+      <w:r>
+        <w:rPr>
+          <w:rFonts w:ascii="Times New Roman" w:hAnsi="Times New Roman" w:cs="Times New Roman"/>
+          <w:kern w:val="0"/>
+          <w14:ligatures w14:val="none"/>
+        </w:rPr>
+        <w:t xml:space="preserve"> </w:t>
+      </w:r>
+      <w:proofErr w:type="spellStart"/>
+      <w:r>
+        <w:rPr>
+          <w:rFonts w:ascii="Times New Roman" w:hAnsi="Times New Roman" w:cs="Times New Roman"/>
+          <w:kern w:val="0"/>
+          <w14:ligatures w14:val="none"/>
+        </w:rPr>
+        <w:t>trị</w:t>
+      </w:r>
+      <w:proofErr w:type="spellEnd"/>
+      <w:r>
+        <w:rPr>
+          <w:rFonts w:ascii="Times New Roman" w:hAnsi="Times New Roman" w:cs="Times New Roman"/>
+          <w:kern w:val="0"/>
+          <w14:ligatures w14:val="none"/>
+        </w:rPr>
+        <w:t>: {{</w:t>
+      </w:r>
+      <w:proofErr w:type="spellStart"/>
+      <w:r>
+        <w:rPr>
+          <w:rFonts w:ascii="Times New Roman" w:hAnsi="Times New Roman" w:cs="Times New Roman"/>
+          <w:kern w:val="0"/>
+          <w14:ligatures w14:val="none"/>
+        </w:rPr>
+        <w:t>TreatmentWork</w:t>
+      </w:r>
+      <w:proofErr w:type="spellEnd"/>
+      <w:r>
+        <w:rPr>
+          <w:rFonts w:ascii="Times New Roman" w:hAnsi="Times New Roman" w:cs="Times New Roman"/>
+          <w:kern w:val="0"/>
+          <w14:ligatures w14:val="none"/>
+        </w:rPr>
+        <w:t>}}</w:t>
       </w:r>
       <w:r>
         <w:rPr>
@@ -245,15 +429,43 @@
           <w:kern w:val="0"/>
           <w14:ligatures w14:val="none"/>
         </w:rPr>
-        <w:t xml:space="preserve">Thanh toán: </w:t>
-      </w:r>
-      <w:r>
-        <w:rPr>
-          <w:rFonts w:ascii="Times New Roman" w:hAnsi="Times New Roman" w:cs="Times New Roman"/>
-          <w:kern w:val="0"/>
-          <w14:ligatures w14:val="none"/>
-        </w:rPr>
-        <w:t xml:space="preserve">{{PaidAmount}} </w:t>
+        <w:t xml:space="preserve">Thanh </w:t>
+      </w:r>
+      <w:proofErr w:type="spellStart"/>
+      <w:r>
+        <w:rPr>
+          <w:rFonts w:ascii="Times New Roman" w:hAnsi="Times New Roman" w:cs="Times New Roman"/>
+          <w:kern w:val="0"/>
+          <w14:ligatures w14:val="none"/>
+        </w:rPr>
+        <w:t>toán</w:t>
+      </w:r>
+      <w:proofErr w:type="spellEnd"/>
+      <w:r>
+        <w:rPr>
+          <w:rFonts w:ascii="Times New Roman" w:hAnsi="Times New Roman" w:cs="Times New Roman"/>
+          <w:kern w:val="0"/>
+          <w14:ligatures w14:val="none"/>
+        </w:rPr>
+        <w:t>: {{</w:t>
+      </w:r>
+      <w:proofErr w:type="spellStart"/>
+      <w:r>
+        <w:rPr>
+          <w:rFonts w:ascii="Times New Roman" w:hAnsi="Times New Roman" w:cs="Times New Roman"/>
+          <w:kern w:val="0"/>
+          <w14:ligatures w14:val="none"/>
+        </w:rPr>
+        <w:t>PaidAmount</w:t>
+      </w:r>
+      <w:proofErr w:type="spellEnd"/>
+      <w:r>
+        <w:rPr>
+          <w:rFonts w:ascii="Times New Roman" w:hAnsi="Times New Roman" w:cs="Times New Roman"/>
+          <w:kern w:val="0"/>
+          <w14:ligatures w14:val="none"/>
+        </w:rPr>
+        <w:t>}}</w:t>
       </w:r>
       <w:r>
         <w:rPr>
@@ -262,15 +474,78 @@
           <w14:ligatures w14:val="none"/>
         </w:rPr>
         <w:tab/>
-        <w:t xml:space="preserve">Viết bằng chữ: </w:t>
-      </w:r>
-      <w:r>
-        <w:rPr>
-          <w:rFonts w:ascii="Times New Roman" w:hAnsi="Times New Roman" w:cs="Times New Roman"/>
-          <w:kern w:val="0"/>
-          <w14:ligatures w14:val="none"/>
-        </w:rPr>
-        <w:t xml:space="preserve">{{PaidAmountInWords}} </w:t>
+      </w:r>
+      <w:proofErr w:type="spellStart"/>
+      <w:r>
+        <w:rPr>
+          <w:rFonts w:ascii="Times New Roman" w:hAnsi="Times New Roman" w:cs="Times New Roman"/>
+          <w:kern w:val="0"/>
+          <w14:ligatures w14:val="none"/>
+        </w:rPr>
+        <w:t>Viết</w:t>
+      </w:r>
+      <w:proofErr w:type="spellEnd"/>
+      <w:r>
+        <w:rPr>
+          <w:rFonts w:ascii="Times New Roman" w:hAnsi="Times New Roman" w:cs="Times New Roman"/>
+          <w:kern w:val="0"/>
+          <w14:ligatures w14:val="none"/>
+        </w:rPr>
+        <w:t xml:space="preserve"> </w:t>
+      </w:r>
+      <w:proofErr w:type="spellStart"/>
+      <w:r>
+        <w:rPr>
+          <w:rFonts w:ascii="Times New Roman" w:hAnsi="Times New Roman" w:cs="Times New Roman"/>
+          <w:kern w:val="0"/>
+          <w14:ligatures w14:val="none"/>
+        </w:rPr>
+        <w:t>bằng</w:t>
+      </w:r>
+      <w:proofErr w:type="spellEnd"/>
+      <w:r>
+        <w:rPr>
+          <w:rFonts w:ascii="Times New Roman" w:hAnsi="Times New Roman" w:cs="Times New Roman"/>
+          <w:kern w:val="0"/>
+          <w14:ligatures w14:val="none"/>
+        </w:rPr>
+        <w:t xml:space="preserve"> </w:t>
+      </w:r>
+      <w:proofErr w:type="spellStart"/>
+      <w:r>
+        <w:rPr>
+          <w:rFonts w:ascii="Times New Roman" w:hAnsi="Times New Roman" w:cs="Times New Roman"/>
+          <w:kern w:val="0"/>
+          <w14:ligatures w14:val="none"/>
+        </w:rPr>
+        <w:t>chữ</w:t>
+      </w:r>
+      <w:proofErr w:type="spellEnd"/>
+      <w:r>
+        <w:rPr>
+          <w:rFonts w:ascii="Times New Roman" w:hAnsi="Times New Roman" w:cs="Times New Roman"/>
+          <w:kern w:val="0"/>
+          <w14:ligatures w14:val="none"/>
+        </w:rPr>
+        <w:t>: {{</w:t>
+      </w:r>
+      <w:proofErr w:type="spellStart"/>
+      <w:r>
+        <w:rPr>
+          <w:rFonts w:ascii="Times New Roman" w:hAnsi="Times New Roman" w:cs="Times New Roman"/>
+          <w:kern w:val="0"/>
+          <w14:ligatures w14:val="none"/>
+        </w:rPr>
+        <w:t>PaidAmountInWords</w:t>
+      </w:r>
+      <w:proofErr w:type="spellEnd"/>
+      <w:r>
+        <w:rPr>
+          <w:rFonts w:ascii="Times New Roman" w:hAnsi="Times New Roman" w:cs="Times New Roman"/>
+          <w:kern w:val="0"/>
+          <w14:ligatures w14:val="none"/>
+        </w:rPr>
+        <w:t>}}</w:t>
       </w:r>
       <w:r>
         <w:rPr>
@@ -293,21 +568,95 @@
           <w14:ligatures w14:val="none"/>
         </w:rPr>
       </w:pPr>
-      <w:r>
-        <w:rPr>
-          <w:rFonts w:ascii="Times New Roman" w:hAnsi="Times New Roman" w:cs="Times New Roman"/>
-          <w:kern w:val="0"/>
-          <w14:ligatures w14:val="none"/>
-        </w:rPr>
-        <w:t xml:space="preserve">Số tiền còn lại: </w:t>
-      </w:r>
-      <w:r>
-        <w:rPr>
-          <w:rFonts w:ascii="Times New Roman" w:hAnsi="Times New Roman" w:cs="Times New Roman"/>
-          <w:kern w:val="0"/>
-          <w14:ligatures w14:val="none"/>
-        </w:rPr>
-        <w:t xml:space="preserve">{{RemainingAmount}} </w:t>
+      <w:proofErr w:type="spellStart"/>
+      <w:r>
+        <w:rPr>
+          <w:rFonts w:ascii="Times New Roman" w:hAnsi="Times New Roman" w:cs="Times New Roman"/>
+          <w:kern w:val="0"/>
+          <w14:ligatures w14:val="none"/>
+        </w:rPr>
+        <w:t>Số</w:t>
+      </w:r>
+      <w:proofErr w:type="spellEnd"/>
+      <w:r>
+        <w:rPr>
+          <w:rFonts w:ascii="Times New Roman" w:hAnsi="Times New Roman" w:cs="Times New Roman"/>
+          <w:kern w:val="0"/>
+          <w14:ligatures w14:val="none"/>
+        </w:rPr>
+        <w:t xml:space="preserve"> </w:t>
+      </w:r>
+      <w:proofErr w:type="spellStart"/>
+      <w:r>
+        <w:rPr>
+          <w:rFonts w:ascii="Times New Roman" w:hAnsi="Times New Roman" w:cs="Times New Roman"/>
+          <w:kern w:val="0"/>
+          <w14:ligatures w14:val="none"/>
+        </w:rPr>
+        <w:t>tiền</w:t>
+      </w:r>
+      <w:proofErr w:type="spellEnd"/>
+      <w:r>
+        <w:rPr>
+          <w:rFonts w:ascii="Times New Roman" w:hAnsi="Times New Roman" w:cs="Times New Roman"/>
+          <w:kern w:val="0"/>
+          <w14:ligatures w14:val="none"/>
+        </w:rPr>
+        <w:t xml:space="preserve"> </w:t>
+      </w:r>
+      <w:proofErr w:type="spellStart"/>
+      <w:r>
+        <w:rPr>
+          <w:rFonts w:ascii="Times New Roman" w:hAnsi="Times New Roman" w:cs="Times New Roman"/>
+          <w:kern w:val="0"/>
+          <w14:ligatures w14:val="none"/>
+        </w:rPr>
+        <w:t>còn</w:t>
+      </w:r>
+      <w:proofErr w:type="spellEnd"/>
+      <w:r>
+        <w:rPr>
+          <w:rFonts w:ascii="Times New Roman" w:hAnsi="Times New Roman" w:cs="Times New Roman"/>
+          <w:kern w:val="0"/>
+          <w14:ligatures w14:val="none"/>
+        </w:rPr>
+        <w:t xml:space="preserve"> </w:t>
+      </w:r>
+      <w:proofErr w:type="spellStart"/>
+      <w:r>
+        <w:rPr>
+          <w:rFonts w:ascii="Times New Roman" w:hAnsi="Times New Roman" w:cs="Times New Roman"/>
+          <w:kern w:val="0"/>
+          <w14:ligatures w14:val="none"/>
+        </w:rPr>
+        <w:t>lại</w:t>
+      </w:r>
+      <w:proofErr w:type="spellEnd"/>
+      <w:r>
+        <w:rPr>
+          <w:rFonts w:ascii="Times New Roman" w:hAnsi="Times New Roman" w:cs="Times New Roman"/>
+          <w:kern w:val="0"/>
+          <w14:ligatures w14:val="none"/>
+        </w:rPr>
+        <w:t>: {{</w:t>
+      </w:r>
+      <w:proofErr w:type="spellStart"/>
+      <w:r>
+        <w:rPr>
+          <w:rFonts w:ascii="Times New Roman" w:hAnsi="Times New Roman" w:cs="Times New Roman"/>
+          <w:kern w:val="0"/>
+          <w14:ligatures w14:val="none"/>
+        </w:rPr>
+        <w:t>RemainingAmount</w:t>
+      </w:r>
+      <w:proofErr w:type="spellEnd"/>
+      <w:r>
+        <w:rPr>
+          <w:rFonts w:ascii="Times New Roman" w:hAnsi="Times New Roman" w:cs="Times New Roman"/>
+          <w:kern w:val="0"/>
+          <w14:ligatures w14:val="none"/>
+        </w:rPr>
+        <w:t>}}</w:t>
       </w:r>
       <w:r>
         <w:rPr>
@@ -316,15 +665,78 @@
           <w14:ligatures w14:val="none"/>
         </w:rPr>
         <w:tab/>
-        <w:t xml:space="preserve">Viết bằng chữ: </w:t>
-      </w:r>
-      <w:r>
-        <w:rPr>
-          <w:rFonts w:ascii="Times New Roman" w:hAnsi="Times New Roman" w:cs="Times New Roman"/>
-          <w:kern w:val="0"/>
-          <w14:ligatures w14:val="none"/>
-        </w:rPr>
-        <w:t xml:space="preserve">{{RemainingAmountInWords}} </w:t>
+      </w:r>
+      <w:proofErr w:type="spellStart"/>
+      <w:r>
+        <w:rPr>
+          <w:rFonts w:ascii="Times New Roman" w:hAnsi="Times New Roman" w:cs="Times New Roman"/>
+          <w:kern w:val="0"/>
+          <w14:ligatures w14:val="none"/>
+        </w:rPr>
+        <w:t>Viết</w:t>
+      </w:r>
+      <w:proofErr w:type="spellEnd"/>
+      <w:r>
+        <w:rPr>
+          <w:rFonts w:ascii="Times New Roman" w:hAnsi="Times New Roman" w:cs="Times New Roman"/>
+          <w:kern w:val="0"/>
+          <w14:ligatures w14:val="none"/>
+        </w:rPr>
+        <w:t xml:space="preserve"> </w:t>
+      </w:r>
+      <w:proofErr w:type="spellStart"/>
+      <w:r>
+        <w:rPr>
+          <w:rFonts w:ascii="Times New Roman" w:hAnsi="Times New Roman" w:cs="Times New Roman"/>
+          <w:kern w:val="0"/>
+          <w14:ligatures w14:val="none"/>
+        </w:rPr>
+        <w:t>bằng</w:t>
+      </w:r>
+      <w:proofErr w:type="spellEnd"/>
+      <w:r>
+        <w:rPr>
+          <w:rFonts w:ascii="Times New Roman" w:hAnsi="Times New Roman" w:cs="Times New Roman"/>
+          <w:kern w:val="0"/>
+          <w14:ligatures w14:val="none"/>
+        </w:rPr>
+        <w:t xml:space="preserve"> </w:t>
+      </w:r>
+      <w:proofErr w:type="spellStart"/>
+      <w:r>
+        <w:rPr>
+          <w:rFonts w:ascii="Times New Roman" w:hAnsi="Times New Roman" w:cs="Times New Roman"/>
+          <w:kern w:val="0"/>
+          <w14:ligatures w14:val="none"/>
+        </w:rPr>
+        <w:t>chữ</w:t>
+      </w:r>
+      <w:proofErr w:type="spellEnd"/>
+      <w:r>
+        <w:rPr>
+          <w:rFonts w:ascii="Times New Roman" w:hAnsi="Times New Roman" w:cs="Times New Roman"/>
+          <w:kern w:val="0"/>
+          <w14:ligatures w14:val="none"/>
+        </w:rPr>
+        <w:t>: {{</w:t>
+      </w:r>
+      <w:proofErr w:type="spellStart"/>
+      <w:r>
+        <w:rPr>
+          <w:rFonts w:ascii="Times New Roman" w:hAnsi="Times New Roman" w:cs="Times New Roman"/>
+          <w:kern w:val="0"/>
+          <w14:ligatures w14:val="none"/>
+        </w:rPr>
+        <w:t>RemainingAmountInWords</w:t>
+      </w:r>
+      <w:proofErr w:type="spellEnd"/>
+      <w:r>
+        <w:rPr>
+          <w:rFonts w:ascii="Times New Roman" w:hAnsi="Times New Roman" w:cs="Times New Roman"/>
+          <w:kern w:val="0"/>
+          <w14:ligatures w14:val="none"/>
+        </w:rPr>
+        <w:t>}}</w:t>
       </w:r>
       <w:r>
         <w:rPr>
@@ -385,13 +797,113 @@
                 <w14:ligatures w14:val="none"/>
               </w:rPr>
             </w:pPr>
-            <w:r>
-              <w:rPr>
-                <w:rFonts w:ascii="Times New Roman" w:hAnsi="Times New Roman" w:cs="Times New Roman"/>
-                <w:kern w:val="0"/>
-                <w14:ligatures w14:val="none"/>
-              </w:rPr>
-              <w:t>Người nộp tiền (ký, họ tên)</w:t>
+            <w:proofErr w:type="spellStart"/>
+            <w:r>
+              <w:rPr>
+                <w:rFonts w:ascii="Times New Roman" w:hAnsi="Times New Roman" w:cs="Times New Roman"/>
+                <w:kern w:val="0"/>
+                <w14:ligatures w14:val="none"/>
+              </w:rPr>
+              <w:t>Người</w:t>
+            </w:r>
+            <w:proofErr w:type="spellEnd"/>
+            <w:r>
+              <w:rPr>
+                <w:rFonts w:ascii="Times New Roman" w:hAnsi="Times New Roman" w:cs="Times New Roman"/>
+                <w:kern w:val="0"/>
+                <w14:ligatures w14:val="none"/>
+              </w:rPr>
+              <w:t xml:space="preserve"> </w:t>
+            </w:r>
+            <w:proofErr w:type="spellStart"/>
+            <w:r>
+              <w:rPr>
+                <w:rFonts w:ascii="Times New Roman" w:hAnsi="Times New Roman" w:cs="Times New Roman"/>
+                <w:kern w:val="0"/>
+                <w14:ligatures w14:val="none"/>
+              </w:rPr>
+              <w:t>nộp</w:t>
+            </w:r>
+            <w:proofErr w:type="spellEnd"/>
+            <w:r>
+              <w:rPr>
+                <w:rFonts w:ascii="Times New Roman" w:hAnsi="Times New Roman" w:cs="Times New Roman"/>
+                <w:kern w:val="0"/>
+                <w14:ligatures w14:val="none"/>
+              </w:rPr>
+              <w:t xml:space="preserve"> </w:t>
+            </w:r>
+            <w:proofErr w:type="spellStart"/>
+            <w:r>
+              <w:rPr>
+                <w:rFonts w:ascii="Times New Roman" w:hAnsi="Times New Roman" w:cs="Times New Roman"/>
+                <w:kern w:val="0"/>
+                <w14:ligatures w14:val="none"/>
+              </w:rPr>
+              <w:t>tiền</w:t>
+            </w:r>
+            <w:proofErr w:type="spellEnd"/>
+            <w:r>
+              <w:rPr>
+                <w:rFonts w:ascii="Times New Roman" w:hAnsi="Times New Roman" w:cs="Times New Roman"/>
+                <w:kern w:val="0"/>
+                <w14:ligatures w14:val="none"/>
+              </w:rPr>
+              <w:t xml:space="preserve"> (</w:t>
+            </w:r>
+            <w:proofErr w:type="spellStart"/>
+            <w:r>
+              <w:rPr>
+                <w:rFonts w:ascii="Times New Roman" w:hAnsi="Times New Roman" w:cs="Times New Roman"/>
+                <w:kern w:val="0"/>
+                <w14:ligatures w14:val="none"/>
+              </w:rPr>
+              <w:t>ký</w:t>
+            </w:r>
+            <w:proofErr w:type="spellEnd"/>
+            <w:r>
+              <w:rPr>
+                <w:rFonts w:ascii="Times New Roman" w:hAnsi="Times New Roman" w:cs="Times New Roman"/>
+                <w:kern w:val="0"/>
+                <w14:ligatures w14:val="none"/>
+              </w:rPr>
+              <w:t xml:space="preserve">, </w:t>
+            </w:r>
+            <w:proofErr w:type="spellStart"/>
+            <w:r>
+              <w:rPr>
+                <w:rFonts w:ascii="Times New Roman" w:hAnsi="Times New Roman" w:cs="Times New Roman"/>
+                <w:kern w:val="0"/>
+                <w14:ligatures w14:val="none"/>
+              </w:rPr>
+              <w:t>họ</w:t>
+            </w:r>
+            <w:proofErr w:type="spellEnd"/>
+            <w:r>
+              <w:rPr>
+                <w:rFonts w:ascii="Times New Roman" w:hAnsi="Times New Roman" w:cs="Times New Roman"/>
+                <w:kern w:val="0"/>
+                <w14:ligatures w14:val="none"/>
+              </w:rPr>
+              <w:t xml:space="preserve"> </w:t>
+            </w:r>
+            <w:proofErr w:type="spellStart"/>
+            <w:r>
+              <w:rPr>
+                <w:rFonts w:ascii="Times New Roman" w:hAnsi="Times New Roman" w:cs="Times New Roman"/>
+                <w:kern w:val="0"/>
+                <w14:ligatures w14:val="none"/>
+              </w:rPr>
+              <w:t>tên</w:t>
+            </w:r>
+            <w:proofErr w:type="spellEnd"/>
+            <w:r>
+              <w:rPr>
+                <w:rFonts w:ascii="Times New Roman" w:hAnsi="Times New Roman" w:cs="Times New Roman"/>
+                <w:kern w:val="0"/>
+                <w14:ligatures w14:val="none"/>
+              </w:rPr>
+              <w:t>)</w:t>
             </w:r>
           </w:p>
           <w:p>
@@ -441,7 +953,29 @@
                 <w:kern w:val="0"/>
                 <w14:ligatures w14:val="none"/>
               </w:rPr>
-              <w:t xml:space="preserve">{{PayerName}}</w:t>
+              <w:t>{{</w:t>
+            </w:r>
+            <w:proofErr w:type="spellStart"/>
+            <w:r>
+              <w:rPr>
+                <w:rFonts w:ascii="Times New Roman" w:hAnsi="Times New Roman" w:cs="Times New Roman"/>
+                <w:b/>
+                <w:bCs/>
+                <w:kern w:val="0"/>
+                <w14:ligatures w14:val="none"/>
+              </w:rPr>
+              <w:t>PayerName</w:t>
+            </w:r>
+            <w:proofErr w:type="spellEnd"/>
+            <w:r>
+              <w:rPr>
+                <w:rFonts w:ascii="Times New Roman" w:hAnsi="Times New Roman" w:cs="Times New Roman"/>
+                <w:b/>
+                <w:bCs/>
+                <w:kern w:val="0"/>
+                <w14:ligatures w14:val="none"/>
+              </w:rPr>
+              <w:t>}}</w:t>
             </w:r>
           </w:p>
         </w:tc>
@@ -461,14 +995,52 @@
                 <w14:ligatures w14:val="none"/>
               </w:rPr>
             </w:pPr>
-            <w:r>
-              <w:rPr>
-                <w:rFonts w:ascii="Times New Roman" w:hAnsi="Times New Roman" w:cs="Times New Roman"/>
-                <w:kern w:val="0"/>
-                <w14:ligatures w14:val="none"/>
-              </w:rPr>
-              <w:t>Ngày lập phiếu</w:t>
-            </w:r>
+            <w:proofErr w:type="spellStart"/>
+            <w:r>
+              <w:rPr>
+                <w:rFonts w:ascii="Times New Roman" w:hAnsi="Times New Roman" w:cs="Times New Roman"/>
+                <w:kern w:val="0"/>
+                <w14:ligatures w14:val="none"/>
+              </w:rPr>
+              <w:t>Ngày</w:t>
+            </w:r>
+            <w:proofErr w:type="spellEnd"/>
+            <w:r>
+              <w:rPr>
+                <w:rFonts w:ascii="Times New Roman" w:hAnsi="Times New Roman" w:cs="Times New Roman"/>
+                <w:kern w:val="0"/>
+                <w14:ligatures w14:val="none"/>
+              </w:rPr>
+              <w:t xml:space="preserve"> </w:t>
+            </w:r>
+            <w:proofErr w:type="spellStart"/>
+            <w:r>
+              <w:rPr>
+                <w:rFonts w:ascii="Times New Roman" w:hAnsi="Times New Roman" w:cs="Times New Roman"/>
+                <w:kern w:val="0"/>
+                <w14:ligatures w14:val="none"/>
+              </w:rPr>
+              <w:t>lập</w:t>
+            </w:r>
+            <w:proofErr w:type="spellEnd"/>
+            <w:r>
+              <w:rPr>
+                <w:rFonts w:ascii="Times New Roman" w:hAnsi="Times New Roman" w:cs="Times New Roman"/>
+                <w:kern w:val="0"/>
+                <w14:ligatures w14:val="none"/>
+              </w:rPr>
+              <w:t xml:space="preserve"> </w:t>
+            </w:r>
+            <w:proofErr w:type="spellStart"/>
+            <w:r>
+              <w:rPr>
+                <w:rFonts w:ascii="Times New Roman" w:hAnsi="Times New Roman" w:cs="Times New Roman"/>
+                <w:kern w:val="0"/>
+                <w14:ligatures w14:val="none"/>
+              </w:rPr>
+              <w:t>phiếu</w:t>
+            </w:r>
+            <w:proofErr w:type="spellEnd"/>
           </w:p>
           <w:p>
             <w:pPr>
@@ -515,7 +1087,25 @@
                 <w:kern w:val="0"/>
                 <w14:ligatures w14:val="none"/>
               </w:rPr>
-              <w:t xml:space="preserve">{{IssueDate}}</w:t>
+              <w:t>{{</w:t>
+            </w:r>
+            <w:proofErr w:type="spellStart"/>
+            <w:r>
+              <w:rPr>
+                <w:rFonts w:ascii="Times New Roman" w:hAnsi="Times New Roman" w:cs="Times New Roman"/>
+                <w:kern w:val="0"/>
+                <w14:ligatures w14:val="none"/>
+              </w:rPr>
+              <w:t>IssueDate</w:t>
+            </w:r>
+            <w:proofErr w:type="spellEnd"/>
+            <w:r>
+              <w:rPr>
+                <w:rFonts w:ascii="Times New Roman" w:hAnsi="Times New Roman" w:cs="Times New Roman"/>
+                <w:kern w:val="0"/>
+                <w14:ligatures w14:val="none"/>
+              </w:rPr>
+              <w:t>}}</w:t>
             </w:r>
           </w:p>
         </w:tc>
@@ -535,13 +1125,113 @@
                 <w14:ligatures w14:val="none"/>
               </w:rPr>
             </w:pPr>
-            <w:r>
-              <w:rPr>
-                <w:rFonts w:ascii="Times New Roman" w:hAnsi="Times New Roman" w:cs="Times New Roman"/>
-                <w:kern w:val="0"/>
-                <w14:ligatures w14:val="none"/>
-              </w:rPr>
-              <w:t>Người lập phiếu (ký, họ tên)</w:t>
+            <w:proofErr w:type="spellStart"/>
+            <w:r>
+              <w:rPr>
+                <w:rFonts w:ascii="Times New Roman" w:hAnsi="Times New Roman" w:cs="Times New Roman"/>
+                <w:kern w:val="0"/>
+                <w14:ligatures w14:val="none"/>
+              </w:rPr>
+              <w:t>Người</w:t>
+            </w:r>
+            <w:proofErr w:type="spellEnd"/>
+            <w:r>
+              <w:rPr>
+                <w:rFonts w:ascii="Times New Roman" w:hAnsi="Times New Roman" w:cs="Times New Roman"/>
+                <w:kern w:val="0"/>
+                <w14:ligatures w14:val="none"/>
+              </w:rPr>
+              <w:t xml:space="preserve"> </w:t>
+            </w:r>
+            <w:proofErr w:type="spellStart"/>
+            <w:r>
+              <w:rPr>
+                <w:rFonts w:ascii="Times New Roman" w:hAnsi="Times New Roman" w:cs="Times New Roman"/>
+                <w:kern w:val="0"/>
+                <w14:ligatures w14:val="none"/>
+              </w:rPr>
+              <w:t>lập</w:t>
+            </w:r>
+            <w:proofErr w:type="spellEnd"/>
+            <w:r>
+              <w:rPr>
+                <w:rFonts w:ascii="Times New Roman" w:hAnsi="Times New Roman" w:cs="Times New Roman"/>
+                <w:kern w:val="0"/>
+                <w14:ligatures w14:val="none"/>
+              </w:rPr>
+              <w:t xml:space="preserve"> </w:t>
+            </w:r>
+            <w:proofErr w:type="spellStart"/>
+            <w:r>
+              <w:rPr>
+                <w:rFonts w:ascii="Times New Roman" w:hAnsi="Times New Roman" w:cs="Times New Roman"/>
+                <w:kern w:val="0"/>
+                <w14:ligatures w14:val="none"/>
+              </w:rPr>
+              <w:t>phiếu</w:t>
+            </w:r>
+            <w:proofErr w:type="spellEnd"/>
+            <w:r>
+              <w:rPr>
+                <w:rFonts w:ascii="Times New Roman" w:hAnsi="Times New Roman" w:cs="Times New Roman"/>
+                <w:kern w:val="0"/>
+                <w14:ligatures w14:val="none"/>
+              </w:rPr>
+              <w:t xml:space="preserve"> (</w:t>
+            </w:r>
+            <w:proofErr w:type="spellStart"/>
+            <w:r>
+              <w:rPr>
+                <w:rFonts w:ascii="Times New Roman" w:hAnsi="Times New Roman" w:cs="Times New Roman"/>
+                <w:kern w:val="0"/>
+                <w14:ligatures w14:val="none"/>
+              </w:rPr>
+              <w:t>ký</w:t>
+            </w:r>
+            <w:proofErr w:type="spellEnd"/>
+            <w:r>
+              <w:rPr>
+                <w:rFonts w:ascii="Times New Roman" w:hAnsi="Times New Roman" w:cs="Times New Roman"/>
+                <w:kern w:val="0"/>
+                <w14:ligatures w14:val="none"/>
+              </w:rPr>
+              <w:t xml:space="preserve">, </w:t>
+            </w:r>
+            <w:proofErr w:type="spellStart"/>
+            <w:r>
+              <w:rPr>
+                <w:rFonts w:ascii="Times New Roman" w:hAnsi="Times New Roman" w:cs="Times New Roman"/>
+                <w:kern w:val="0"/>
+                <w14:ligatures w14:val="none"/>
+              </w:rPr>
+              <w:t>họ</w:t>
+            </w:r>
+            <w:proofErr w:type="spellEnd"/>
+            <w:r>
+              <w:rPr>
+                <w:rFonts w:ascii="Times New Roman" w:hAnsi="Times New Roman" w:cs="Times New Roman"/>
+                <w:kern w:val="0"/>
+                <w14:ligatures w14:val="none"/>
+              </w:rPr>
+              <w:t xml:space="preserve"> </w:t>
+            </w:r>
+            <w:proofErr w:type="spellStart"/>
+            <w:r>
+              <w:rPr>
+                <w:rFonts w:ascii="Times New Roman" w:hAnsi="Times New Roman" w:cs="Times New Roman"/>
+                <w:kern w:val="0"/>
+                <w14:ligatures w14:val="none"/>
+              </w:rPr>
+              <w:t>tên</w:t>
+            </w:r>
+            <w:proofErr w:type="spellEnd"/>
+            <w:r>
+              <w:rPr>
+                <w:rFonts w:ascii="Times New Roman" w:hAnsi="Times New Roman" w:cs="Times New Roman"/>
+                <w:kern w:val="0"/>
+                <w14:ligatures w14:val="none"/>
+              </w:rPr>
+              <w:t>)</w:t>
             </w:r>
           </w:p>
           <w:p>
@@ -591,7 +1281,29 @@
                 <w:kern w:val="0"/>
                 <w14:ligatures w14:val="none"/>
               </w:rPr>
-              <w:t xml:space="preserve">{{CashierName}}</w:t>
+              <w:t>{{</w:t>
+            </w:r>
+            <w:proofErr w:type="spellStart"/>
+            <w:r>
+              <w:rPr>
+                <w:rFonts w:ascii="Times New Roman" w:hAnsi="Times New Roman" w:cs="Times New Roman"/>
+                <w:b/>
+                <w:bCs/>
+                <w:kern w:val="0"/>
+                <w14:ligatures w14:val="none"/>
+              </w:rPr>
+              <w:t>CashierName</w:t>
+            </w:r>
+            <w:proofErr w:type="spellEnd"/>
+            <w:r>
+              <w:rPr>
+                <w:rFonts w:ascii="Times New Roman" w:hAnsi="Times New Roman" w:cs="Times New Roman"/>
+                <w:b/>
+                <w:bCs/>
+                <w:kern w:val="0"/>
+                <w14:ligatures w14:val="none"/>
+              </w:rPr>
+              <w:t>}}</w:t>
             </w:r>
           </w:p>
         </w:tc>
@@ -599,6 +1311,89 @@
     </w:tbl>
     <w:p>
       <w:pPr>
+        <w:rPr>
+          <w:rFonts w:ascii="Times New Roman" w:hAnsi="Times New Roman" w:cs="Times New Roman"/>
+        </w:rPr>
+      </w:pPr>
+      <w:r>
+        <w:rPr>
+          <w:rFonts w:ascii="Times New Roman" w:hAnsi="Times New Roman" w:cs="Times New Roman"/>
+          <w:noProof/>
+        </w:rPr>
+        <mc:AlternateContent>
+          <mc:Choice Requires="wps">
+            <w:drawing>
+              <wp:anchor distT="0" distB="0" distL="114300" distR="114300" simplePos="0" relativeHeight="251659264" behindDoc="0" locked="0" layoutInCell="1" allowOverlap="1" wp14:anchorId="7A9F5E78" wp14:editId="41A1B1E0">
+                <wp:simplePos x="0" y="0"/>
+                <wp:positionH relativeFrom="column">
+                  <wp:posOffset>5180965</wp:posOffset>
+                </wp:positionH>
+                <wp:positionV relativeFrom="paragraph">
+                  <wp:posOffset>290830</wp:posOffset>
+                </wp:positionV>
+                <wp:extent cx="755650" cy="755650"/>
+                <wp:effectExtent l="0" t="0" r="25400" b="25400"/>
+                <wp:wrapNone/>
+                <wp:docPr id="1230919300" name="Rectangle 1"/>
+                <wp:cNvGraphicFramePr/>
+                <a:graphic xmlns:a="http://schemas.openxmlformats.org/drawingml/2006/main">
+                  <a:graphicData uri="http://schemas.microsoft.com/office/word/2010/wordprocessingShape">
+                    <wps:wsp>
+                      <wps:cNvSpPr/>
+                      <wps:spPr>
+                        <a:xfrm>
+                          <a:off x="0" y="0"/>
+                          <a:ext cx="755650" cy="755650"/>
+                        </a:xfrm>
+                        <a:prstGeom prst="rect">
+                          <a:avLst/>
+                        </a:prstGeom>
+                      </wps:spPr>
+                      <wps:style>
+                        <a:lnRef idx="2">
+                          <a:schemeClr val="accent1">
+                            <a:shade val="15000"/>
+                          </a:schemeClr>
+                        </a:lnRef>
+                        <a:fillRef idx="1">
+                          <a:schemeClr val="accent1"/>
+                        </a:fillRef>
+                        <a:effectRef idx="0">
+                          <a:schemeClr val="accent1"/>
+                        </a:effectRef>
+                        <a:fontRef idx="minor">
+                          <a:schemeClr val="lt1"/>
+                        </a:fontRef>
+                      </wps:style>
+                      <wps:bodyPr rot="0" spcFirstLastPara="0" vertOverflow="overflow" horzOverflow="overflow" vert="horz" wrap="square" lIns="91440" tIns="45720" rIns="91440" bIns="45720" numCol="1" spcCol="0" rtlCol="0" fromWordArt="0" anchor="ctr" anchorCtr="0" forceAA="0" compatLnSpc="1">
+                        <a:prstTxWarp prst="textNoShape">
+                          <a:avLst/>
+                        </a:prstTxWarp>
+                        <a:noAutofit/>
+                      </wps:bodyPr>
+                    </wps:wsp>
+                  </a:graphicData>
+                </a:graphic>
+                <wp14:sizeRelH relativeFrom="margin">
+                  <wp14:pctWidth>0</wp14:pctWidth>
+                </wp14:sizeRelH>
+                <wp14:sizeRelV relativeFrom="margin">
+                  <wp14:pctHeight>0</wp14:pctHeight>
+                </wp14:sizeRelV>
+              </wp:anchor>
+            </w:drawing>
+          </mc:Choice>
+          <mc:Fallback>
+            <w:pict>
+              <v:rect w14:anchorId="52695D8D" id="Rectangle 1" o:spid="_x0000_s1026" style="position:absolute;margin-left:407.95pt;margin-top:22.9pt;width:59.5pt;height:59.5pt;z-index:251659264;visibility:visible;mso-wrap-style:square;mso-width-percent:0;mso-height-percent:0;mso-wrap-distance-left:9pt;mso-wrap-distance-top:0;mso-wrap-distance-right:9pt;mso-wrap-distance-bottom:0;mso-position-horizontal:absolute;mso-position-horizontal-relative:text;mso-position-vertical:absolute;mso-position-vertical-relative:text;mso-width-percent:0;mso-height-percent:0;mso-width-relative:margin;mso-height-relative:margin;v-text-anchor:middle" o:gfxdata="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" fillcolor="#4472c4 [3204]" strokecolor="#09101d [484]" strokeweight="1pt"/>
+            </w:pict>
+          </mc:Fallback>
+        </mc:AlternateContent>
+      </w:r>
+    </w:p>
+    <w:p>
+      <w:pPr>
+        <w:jc w:val="center"/>
         <w:rPr>
           <w:rFonts w:ascii="Times New Roman" w:hAnsi="Times New Roman" w:cs="Times New Roman"/>
         </w:rPr>
@@ -647,14 +1442,514 @@
       <w:pStyle w:val="Footer"/>
       <w:rPr>
         <w:rFonts w:ascii="Times New Roman" w:hAnsi="Times New Roman" w:cs="Times New Roman"/>
+        <w:sz w:val="18"/>
+        <w:szCs w:val="18"/>
       </w:rPr>
     </w:pPr>
     <w:r>
       <w:rPr>
         <w:rFonts w:ascii="Times New Roman" w:hAnsi="Times New Roman" w:cs="Times New Roman"/>
-      </w:rPr>
-      <w:t>Lưu ý: Giữ phiếu thu đến khi kết thúc điều trị</w:t>
-    </w:r>
+        <w:sz w:val="18"/>
+        <w:szCs w:val="18"/>
+      </w:rPr>
+      <w:t xml:space="preserve">Lưu ý: </w:t>
+    </w:r>
+    <w:proofErr w:type="spellStart"/>
+    <w:r>
+      <w:rPr>
+        <w:rFonts w:ascii="Times New Roman" w:hAnsi="Times New Roman" w:cs="Times New Roman"/>
+        <w:sz w:val="18"/>
+        <w:szCs w:val="18"/>
+      </w:rPr>
+      <w:t>Giữ</w:t>
+    </w:r>
+    <w:proofErr w:type="spellEnd"/>
+    <w:r>
+      <w:rPr>
+        <w:rFonts w:ascii="Times New Roman" w:hAnsi="Times New Roman" w:cs="Times New Roman"/>
+        <w:sz w:val="18"/>
+        <w:szCs w:val="18"/>
+      </w:rPr>
+      <w:t xml:space="preserve"> </w:t>
+    </w:r>
+    <w:proofErr w:type="spellStart"/>
+    <w:r>
+      <w:rPr>
+        <w:rFonts w:ascii="Times New Roman" w:hAnsi="Times New Roman" w:cs="Times New Roman"/>
+        <w:sz w:val="18"/>
+        <w:szCs w:val="18"/>
+      </w:rPr>
+      <w:t>phiếu</w:t>
+    </w:r>
+    <w:proofErr w:type="spellEnd"/>
+    <w:r>
+      <w:rPr>
+        <w:rFonts w:ascii="Times New Roman" w:hAnsi="Times New Roman" w:cs="Times New Roman"/>
+        <w:sz w:val="18"/>
+        <w:szCs w:val="18"/>
+      </w:rPr>
+      <w:t xml:space="preserve"> </w:t>
+    </w:r>
+    <w:proofErr w:type="spellStart"/>
+    <w:r>
+      <w:rPr>
+        <w:rFonts w:ascii="Times New Roman" w:hAnsi="Times New Roman" w:cs="Times New Roman"/>
+        <w:sz w:val="18"/>
+        <w:szCs w:val="18"/>
+      </w:rPr>
+      <w:t>thu</w:t>
+    </w:r>
+    <w:proofErr w:type="spellEnd"/>
+    <w:r>
+      <w:rPr>
+        <w:rFonts w:ascii="Times New Roman" w:hAnsi="Times New Roman" w:cs="Times New Roman"/>
+        <w:sz w:val="18"/>
+        <w:szCs w:val="18"/>
+      </w:rPr>
+      <w:t xml:space="preserve"> </w:t>
+    </w:r>
+    <w:proofErr w:type="spellStart"/>
+    <w:r>
+      <w:rPr>
+        <w:rFonts w:ascii="Times New Roman" w:hAnsi="Times New Roman" w:cs="Times New Roman"/>
+        <w:sz w:val="18"/>
+        <w:szCs w:val="18"/>
+      </w:rPr>
+      <w:t>đến</w:t>
+    </w:r>
+    <w:proofErr w:type="spellEnd"/>
+    <w:r>
+      <w:rPr>
+        <w:rFonts w:ascii="Times New Roman" w:hAnsi="Times New Roman" w:cs="Times New Roman"/>
+        <w:sz w:val="18"/>
+        <w:szCs w:val="18"/>
+      </w:rPr>
+      <w:t xml:space="preserve"> </w:t>
+    </w:r>
+    <w:proofErr w:type="spellStart"/>
+    <w:r>
+      <w:rPr>
+        <w:rFonts w:ascii="Times New Roman" w:hAnsi="Times New Roman" w:cs="Times New Roman"/>
+        <w:sz w:val="18"/>
+        <w:szCs w:val="18"/>
+      </w:rPr>
+      <w:t>khi</w:t>
+    </w:r>
+    <w:proofErr w:type="spellEnd"/>
+    <w:r>
+      <w:rPr>
+        <w:rFonts w:ascii="Times New Roman" w:hAnsi="Times New Roman" w:cs="Times New Roman"/>
+        <w:sz w:val="18"/>
+        <w:szCs w:val="18"/>
+      </w:rPr>
+      <w:t xml:space="preserve"> </w:t>
+    </w:r>
+    <w:proofErr w:type="spellStart"/>
+    <w:r>
+      <w:rPr>
+        <w:rFonts w:ascii="Times New Roman" w:hAnsi="Times New Roman" w:cs="Times New Roman"/>
+        <w:sz w:val="18"/>
+        <w:szCs w:val="18"/>
+      </w:rPr>
+      <w:t>kết</w:t>
+    </w:r>
+    <w:proofErr w:type="spellEnd"/>
+    <w:r>
+      <w:rPr>
+        <w:rFonts w:ascii="Times New Roman" w:hAnsi="Times New Roman" w:cs="Times New Roman"/>
+        <w:sz w:val="18"/>
+        <w:szCs w:val="18"/>
+      </w:rPr>
+      <w:t xml:space="preserve"> </w:t>
+    </w:r>
+    <w:proofErr w:type="spellStart"/>
+    <w:r>
+      <w:rPr>
+        <w:rFonts w:ascii="Times New Roman" w:hAnsi="Times New Roman" w:cs="Times New Roman"/>
+        <w:sz w:val="18"/>
+        <w:szCs w:val="18"/>
+      </w:rPr>
+      <w:t>thúc</w:t>
+    </w:r>
+    <w:proofErr w:type="spellEnd"/>
+    <w:r>
+      <w:rPr>
+        <w:rFonts w:ascii="Times New Roman" w:hAnsi="Times New Roman" w:cs="Times New Roman"/>
+        <w:sz w:val="18"/>
+        <w:szCs w:val="18"/>
+      </w:rPr>
+      <w:t xml:space="preserve"> </w:t>
+    </w:r>
+    <w:proofErr w:type="spellStart"/>
+    <w:r>
+      <w:rPr>
+        <w:rFonts w:ascii="Times New Roman" w:hAnsi="Times New Roman" w:cs="Times New Roman"/>
+        <w:sz w:val="18"/>
+        <w:szCs w:val="18"/>
+      </w:rPr>
+      <w:t>điều</w:t>
+    </w:r>
+    <w:proofErr w:type="spellEnd"/>
+    <w:r>
+      <w:rPr>
+        <w:rFonts w:ascii="Times New Roman" w:hAnsi="Times New Roman" w:cs="Times New Roman"/>
+        <w:sz w:val="18"/>
+        <w:szCs w:val="18"/>
+      </w:rPr>
+      <w:t xml:space="preserve"> </w:t>
+    </w:r>
+    <w:proofErr w:type="spellStart"/>
+    <w:r>
+      <w:rPr>
+        <w:rFonts w:ascii="Times New Roman" w:hAnsi="Times New Roman" w:cs="Times New Roman"/>
+        <w:sz w:val="18"/>
+        <w:szCs w:val="18"/>
+      </w:rPr>
+      <w:t>trị</w:t>
+    </w:r>
+    <w:proofErr w:type="spellEnd"/>
+  </w:p>
+  <w:p>
+    <w:pPr>
+      <w:pStyle w:val="Footer"/>
+      <w:rPr>
+        <w:rFonts w:ascii="Times New Roman" w:hAnsi="Times New Roman" w:cs="Times New Roman"/>
+        <w:sz w:val="18"/>
+        <w:szCs w:val="18"/>
+      </w:rPr>
+    </w:pPr>
+    <w:proofErr w:type="spellStart"/>
+    <w:r>
+      <w:rPr>
+        <w:rFonts w:ascii="Times New Roman" w:hAnsi="Times New Roman" w:cs="Times New Roman"/>
+        <w:sz w:val="18"/>
+        <w:szCs w:val="18"/>
+      </w:rPr>
+      <w:t>Nếu</w:t>
+    </w:r>
+    <w:proofErr w:type="spellEnd"/>
+    <w:r>
+      <w:rPr>
+        <w:rFonts w:ascii="Times New Roman" w:hAnsi="Times New Roman" w:cs="Times New Roman"/>
+        <w:sz w:val="18"/>
+        <w:szCs w:val="18"/>
+      </w:rPr>
+      <w:t xml:space="preserve"> </w:t>
+    </w:r>
+    <w:proofErr w:type="spellStart"/>
+    <w:r>
+      <w:rPr>
+        <w:rFonts w:ascii="Times New Roman" w:hAnsi="Times New Roman" w:cs="Times New Roman"/>
+        <w:sz w:val="18"/>
+        <w:szCs w:val="18"/>
+      </w:rPr>
+      <w:t>có</w:t>
+    </w:r>
+    <w:proofErr w:type="spellEnd"/>
+    <w:r>
+      <w:rPr>
+        <w:rFonts w:ascii="Times New Roman" w:hAnsi="Times New Roman" w:cs="Times New Roman"/>
+        <w:sz w:val="18"/>
+        <w:szCs w:val="18"/>
+      </w:rPr>
+      <w:t xml:space="preserve"> </w:t>
+    </w:r>
+    <w:proofErr w:type="spellStart"/>
+    <w:r>
+      <w:rPr>
+        <w:rFonts w:ascii="Times New Roman" w:hAnsi="Times New Roman" w:cs="Times New Roman"/>
+        <w:sz w:val="18"/>
+        <w:szCs w:val="18"/>
+      </w:rPr>
+      <w:t>nhu</w:t>
+    </w:r>
+    <w:proofErr w:type="spellEnd"/>
+    <w:r>
+      <w:rPr>
+        <w:rFonts w:ascii="Times New Roman" w:hAnsi="Times New Roman" w:cs="Times New Roman"/>
+        <w:sz w:val="18"/>
+        <w:szCs w:val="18"/>
+      </w:rPr>
+      <w:t xml:space="preserve"> </w:t>
+    </w:r>
+    <w:proofErr w:type="spellStart"/>
+    <w:r>
+      <w:rPr>
+        <w:rFonts w:ascii="Times New Roman" w:hAnsi="Times New Roman" w:cs="Times New Roman"/>
+        <w:sz w:val="18"/>
+        <w:szCs w:val="18"/>
+      </w:rPr>
+      <w:t>cầu</w:t>
+    </w:r>
+    <w:proofErr w:type="spellEnd"/>
+    <w:r>
+      <w:rPr>
+        <w:rFonts w:ascii="Times New Roman" w:hAnsi="Times New Roman" w:cs="Times New Roman"/>
+        <w:sz w:val="18"/>
+        <w:szCs w:val="18"/>
+      </w:rPr>
+      <w:t xml:space="preserve"> </w:t>
+    </w:r>
+    <w:proofErr w:type="spellStart"/>
+    <w:r>
+      <w:rPr>
+        <w:rFonts w:ascii="Times New Roman" w:hAnsi="Times New Roman" w:cs="Times New Roman"/>
+        <w:sz w:val="18"/>
+        <w:szCs w:val="18"/>
+      </w:rPr>
+      <w:t>xuất</w:t>
+    </w:r>
+    <w:proofErr w:type="spellEnd"/>
+    <w:r>
+      <w:rPr>
+        <w:rFonts w:ascii="Times New Roman" w:hAnsi="Times New Roman" w:cs="Times New Roman"/>
+        <w:sz w:val="18"/>
+        <w:szCs w:val="18"/>
+      </w:rPr>
+      <w:t xml:space="preserve"> </w:t>
+    </w:r>
+    <w:proofErr w:type="spellStart"/>
+    <w:r>
+      <w:rPr>
+        <w:rFonts w:ascii="Times New Roman" w:hAnsi="Times New Roman" w:cs="Times New Roman"/>
+        <w:sz w:val="18"/>
+        <w:szCs w:val="18"/>
+      </w:rPr>
+      <w:t>hóa</w:t>
+    </w:r>
+    <w:proofErr w:type="spellEnd"/>
+    <w:r>
+      <w:rPr>
+        <w:rFonts w:ascii="Times New Roman" w:hAnsi="Times New Roman" w:cs="Times New Roman"/>
+        <w:sz w:val="18"/>
+        <w:szCs w:val="18"/>
+      </w:rPr>
+      <w:t xml:space="preserve"> </w:t>
+    </w:r>
+    <w:proofErr w:type="spellStart"/>
+    <w:r>
+      <w:rPr>
+        <w:rFonts w:ascii="Times New Roman" w:hAnsi="Times New Roman" w:cs="Times New Roman"/>
+        <w:sz w:val="18"/>
+        <w:szCs w:val="18"/>
+      </w:rPr>
+      <w:t>đơn</w:t>
+    </w:r>
+    <w:proofErr w:type="spellEnd"/>
+    <w:r>
+      <w:rPr>
+        <w:rFonts w:ascii="Times New Roman" w:hAnsi="Times New Roman" w:cs="Times New Roman"/>
+        <w:sz w:val="18"/>
+        <w:szCs w:val="18"/>
+      </w:rPr>
+      <w:t xml:space="preserve"> </w:t>
+    </w:r>
+    <w:proofErr w:type="spellStart"/>
+    <w:r>
+      <w:rPr>
+        <w:rFonts w:ascii="Times New Roman" w:hAnsi="Times New Roman" w:cs="Times New Roman"/>
+        <w:sz w:val="18"/>
+        <w:szCs w:val="18"/>
+      </w:rPr>
+      <w:t>đỏ</w:t>
+    </w:r>
+    <w:proofErr w:type="spellEnd"/>
+    <w:r>
+      <w:rPr>
+        <w:rFonts w:ascii="Times New Roman" w:hAnsi="Times New Roman" w:cs="Times New Roman"/>
+        <w:sz w:val="18"/>
+        <w:szCs w:val="18"/>
+      </w:rPr>
+      <w:t xml:space="preserve">, </w:t>
+    </w:r>
+    <w:proofErr w:type="spellStart"/>
+    <w:r>
+      <w:rPr>
+        <w:rFonts w:ascii="Times New Roman" w:hAnsi="Times New Roman" w:cs="Times New Roman"/>
+        <w:sz w:val="18"/>
+        <w:szCs w:val="18"/>
+      </w:rPr>
+      <w:t>vui</w:t>
+    </w:r>
+    <w:proofErr w:type="spellEnd"/>
+    <w:r>
+      <w:rPr>
+        <w:rFonts w:ascii="Times New Roman" w:hAnsi="Times New Roman" w:cs="Times New Roman"/>
+        <w:sz w:val="18"/>
+        <w:szCs w:val="18"/>
+      </w:rPr>
+      <w:t xml:space="preserve"> </w:t>
+    </w:r>
+    <w:proofErr w:type="spellStart"/>
+    <w:r>
+      <w:rPr>
+        <w:rFonts w:ascii="Times New Roman" w:hAnsi="Times New Roman" w:cs="Times New Roman"/>
+        <w:sz w:val="18"/>
+        <w:szCs w:val="18"/>
+      </w:rPr>
+      <w:t>lòng</w:t>
+    </w:r>
+    <w:proofErr w:type="spellEnd"/>
+    <w:r>
+      <w:rPr>
+        <w:rFonts w:ascii="Times New Roman" w:hAnsi="Times New Roman" w:cs="Times New Roman"/>
+        <w:sz w:val="18"/>
+        <w:szCs w:val="18"/>
+      </w:rPr>
+      <w:t xml:space="preserve"> </w:t>
+    </w:r>
+    <w:proofErr w:type="spellStart"/>
+    <w:r>
+      <w:rPr>
+        <w:rFonts w:ascii="Times New Roman" w:hAnsi="Times New Roman" w:cs="Times New Roman"/>
+        <w:sz w:val="18"/>
+        <w:szCs w:val="18"/>
+      </w:rPr>
+      <w:t>quét</w:t>
+    </w:r>
+    <w:proofErr w:type="spellEnd"/>
+    <w:r>
+      <w:rPr>
+        <w:rFonts w:ascii="Times New Roman" w:hAnsi="Times New Roman" w:cs="Times New Roman"/>
+        <w:sz w:val="18"/>
+        <w:szCs w:val="18"/>
+      </w:rPr>
+      <w:t xml:space="preserve"> </w:t>
+    </w:r>
+    <w:proofErr w:type="spellStart"/>
+    <w:r>
+      <w:rPr>
+        <w:rFonts w:ascii="Times New Roman" w:hAnsi="Times New Roman" w:cs="Times New Roman"/>
+        <w:sz w:val="18"/>
+        <w:szCs w:val="18"/>
+      </w:rPr>
+      <w:t>mã</w:t>
+    </w:r>
+    <w:proofErr w:type="spellEnd"/>
+    <w:r>
+      <w:rPr>
+        <w:rFonts w:ascii="Times New Roman" w:hAnsi="Times New Roman" w:cs="Times New Roman"/>
+        <w:sz w:val="18"/>
+        <w:szCs w:val="18"/>
+      </w:rPr>
+      <w:t xml:space="preserve"> QR </w:t>
+    </w:r>
+    <w:proofErr w:type="spellStart"/>
+    <w:r>
+      <w:rPr>
+        <w:rFonts w:ascii="Times New Roman" w:hAnsi="Times New Roman" w:cs="Times New Roman"/>
+        <w:sz w:val="18"/>
+        <w:szCs w:val="18"/>
+      </w:rPr>
+      <w:t>và</w:t>
+    </w:r>
+    <w:proofErr w:type="spellEnd"/>
+    <w:r>
+      <w:rPr>
+        <w:rFonts w:ascii="Times New Roman" w:hAnsi="Times New Roman" w:cs="Times New Roman"/>
+        <w:sz w:val="18"/>
+        <w:szCs w:val="18"/>
+      </w:rPr>
+      <w:t xml:space="preserve"> </w:t>
+    </w:r>
+    <w:proofErr w:type="spellStart"/>
+    <w:r>
+      <w:rPr>
+        <w:rFonts w:ascii="Times New Roman" w:hAnsi="Times New Roman" w:cs="Times New Roman"/>
+        <w:sz w:val="18"/>
+        <w:szCs w:val="18"/>
+      </w:rPr>
+      <w:t>nhập</w:t>
+    </w:r>
+    <w:proofErr w:type="spellEnd"/>
+    <w:r>
+      <w:rPr>
+        <w:rFonts w:ascii="Times New Roman" w:hAnsi="Times New Roman" w:cs="Times New Roman"/>
+        <w:sz w:val="18"/>
+        <w:szCs w:val="18"/>
+      </w:rPr>
+      <w:t xml:space="preserve"> </w:t>
+    </w:r>
+    <w:proofErr w:type="spellStart"/>
+    <w:r>
+      <w:rPr>
+        <w:rFonts w:ascii="Times New Roman" w:hAnsi="Times New Roman" w:cs="Times New Roman"/>
+        <w:sz w:val="18"/>
+        <w:szCs w:val="18"/>
+      </w:rPr>
+      <w:t>thông</w:t>
+    </w:r>
+    <w:proofErr w:type="spellEnd"/>
+    <w:r>
+      <w:rPr>
+        <w:rFonts w:ascii="Times New Roman" w:hAnsi="Times New Roman" w:cs="Times New Roman"/>
+        <w:sz w:val="18"/>
+        <w:szCs w:val="18"/>
+      </w:rPr>
+      <w:t xml:space="preserve"> </w:t>
+    </w:r>
+    <w:r>
+      <w:rPr>
+        <w:rFonts w:ascii="Times New Roman" w:hAnsi="Times New Roman" w:cs="Times New Roman"/>
+        <w:sz w:val="18"/>
+        <w:szCs w:val="18"/>
+      </w:rPr>
+      <w:t>t</w:t>
+    </w:r>
+    <w:r>
+      <w:rPr>
+        <w:rFonts w:ascii="Times New Roman" w:hAnsi="Times New Roman" w:cs="Times New Roman"/>
+        <w:sz w:val="18"/>
+        <w:szCs w:val="18"/>
+      </w:rPr>
+      <w:t xml:space="preserve">in </w:t>
+    </w:r>
+    <w:proofErr w:type="spellStart"/>
+    <w:r>
+      <w:rPr>
+        <w:rFonts w:ascii="Times New Roman" w:hAnsi="Times New Roman" w:cs="Times New Roman"/>
+        <w:sz w:val="18"/>
+        <w:szCs w:val="18"/>
+      </w:rPr>
+      <w:t>xuất</w:t>
+    </w:r>
+    <w:proofErr w:type="spellEnd"/>
+    <w:r>
+      <w:rPr>
+        <w:rFonts w:ascii="Times New Roman" w:hAnsi="Times New Roman" w:cs="Times New Roman"/>
+        <w:sz w:val="18"/>
+        <w:szCs w:val="18"/>
+      </w:rPr>
+      <w:t xml:space="preserve"> </w:t>
+    </w:r>
+    <w:proofErr w:type="spellStart"/>
+    <w:r>
+      <w:rPr>
+        <w:rFonts w:ascii="Times New Roman" w:hAnsi="Times New Roman" w:cs="Times New Roman"/>
+        <w:sz w:val="18"/>
+        <w:szCs w:val="18"/>
+      </w:rPr>
+      <w:t>hóa</w:t>
+    </w:r>
+    <w:proofErr w:type="spellEnd"/>
+    <w:r>
+      <w:rPr>
+        <w:rFonts w:ascii="Times New Roman" w:hAnsi="Times New Roman" w:cs="Times New Roman"/>
+        <w:sz w:val="18"/>
+        <w:szCs w:val="18"/>
+      </w:rPr>
+      <w:t xml:space="preserve"> </w:t>
+    </w:r>
+    <w:proofErr w:type="spellStart"/>
+    <w:r>
+      <w:rPr>
+        <w:rFonts w:ascii="Times New Roman" w:hAnsi="Times New Roman" w:cs="Times New Roman"/>
+        <w:sz w:val="18"/>
+        <w:szCs w:val="18"/>
+      </w:rPr>
+      <w:t>đơn</w:t>
+    </w:r>
+    <w:proofErr w:type="spellEnd"/>
   </w:p>
 </w:ftr>
 </file>
@@ -1699,557 +2994,6 @@
 </w:styles>
 </file>
 
-<file path=word/glossary/document.xml><?xml version="1.0" encoding="utf-8"?>
-<w:glossaryDocument xmlns:wpc="http://schemas.microsoft.com/office/word/2010/wordprocessingCanvas" xmlns:cx="http://schemas.microsoft.com/office/drawing/2014/chartex" xmlns:cx1="http://schemas.microsoft.com/office/drawing/2015/9/8/chartex" xmlns:cx2="http://schemas.microsoft.com/office/drawing/2015/10/21/chartex" xmlns:cx3="http://schemas.microsoft.com/office/drawing/2016/5/9/chartex" xmlns:cx4="http://schemas.microsoft.com/office/drawing/2016/5/10/chartex" xmlns:cx5="http://schemas.microsoft.com/office/drawing/2016/5/11/chartex" xmlns:cx6="http://schemas.microsoft.com/office/drawing/2016/5/12/chartex" xmlns:cx7="http://schemas.microsoft.com/office/drawing/2016/5/13/chartex" xmlns:cx8="http://schemas.microsoft.com/office/drawing/2016/5/14/chartex" xmlns:mc="http://schemas.openxmlformats.org/markup-compatibility/2006" xmlns:aink="http://schemas.microsoft.com/office/drawing/2016/ink" xmlns:am3d="http://schemas.microsoft.com/office/drawing/2017/model3d" xmlns:o="urn:schemas-microsoft-com:office:office" xmlns:oel="http://schemas.microsoft.com/office/2019/extlst" xmlns:r="http://schemas.openxmlformats.org/officeDocument/2006/relationships" xmlns:m="http://schemas.openxmlformats.org/officeDocument/2006/math" xmlns:v="urn:schemas-microsoft-com:vml" xmlns:wp14="http://schemas.microsoft.com/office/word/2010/wordprocessingDrawing" xmlns:wp="http://schemas.openxmlformats.org/drawingml/2006/wordprocessingDrawing" xmlns:w10="urn:schemas-microsoft-com:office:word" xmlns:w="http://schemas.openxmlformats.org/wordprocessingml/2006/main" xmlns:w14="http://schemas.microsoft.com/office/word/2010/wordml" xmlns:w15="http://schemas.microsoft.com/office/word/2012/wordml" xmlns:w16cex="http://schemas.microsoft.com/office/word/2018/wordml/cex" xmlns:w16cid="http://schemas.microsoft.com/office/word/2016/wordml/cid" xmlns:w16="http://schemas.microsoft.com/office/word/2018/wordml" xmlns:w16du="http://schemas.microsoft.com/office/word/2023/wordml/word16du" xmlns:w16sdtdh="http://schemas.microsoft.com/office/word/2020/wordml/sdtdatahash" xmlns:w16sdtfl="http://schemas.microsoft.com/office/word/2024/wordml/sdtformatlock" xmlns:w16se="http://schemas.microsoft.com/office/word/2015/wordml/symex" xmlns:wpg="http://schemas.microsoft.com/office/word/2010/wordprocessingGroup" xmlns:wpi="http://schemas.microsoft.com/office/word/2010/wordprocessingInk" xmlns:wne="http://schemas.microsoft.com/office/word/2006/wordml" xmlns:wps="http://schemas.microsoft.com/office/word/2010/wordprocessingShape" mc:Ignorable="w14 w15 w16se w16cid w16 w16cex w16sdtdh w16sdtfl w16du wp14">
-  <w:docParts>
-    <w:docPart>
-      <w:docPartPr>
-        <w:name w:val="DefaultPlaceholder_-1854013440"/>
-        <w:category>
-          <w:name w:val="General"/>
-          <w:gallery w:val="placeholder"/>
-        </w:category>
-        <w:types>
-          <w:type w:val="bbPlcHdr"/>
-        </w:types>
-        <w:behaviors>
-          <w:behavior w:val="content"/>
-        </w:behaviors>
-        <w:guid w:val="{E753CB59-50F1-41A3-B159-A977861F70C0}"/>
-      </w:docPartPr>
-      <w:docPartBody>
-        <w:p>
-          <w:r>
-            <w:rPr>
-              <w:rStyle w:val="PlaceholderText"/>
-            </w:rPr>
-            <w:t>Click or tap here to enter text.</w:t>
-          </w:r>
-        </w:p>
-      </w:docPartBody>
-    </w:docPart>
-  </w:docParts>
-</w:glossaryDocument>
-</file>
-
-<file path=word/glossary/fontTable.xml><?xml version="1.0" encoding="utf-8"?>
-<w:fonts xmlns:mc="http://schemas.openxmlformats.org/markup-compatibility/2006" xmlns:r="http://schemas.openxmlformats.org/officeDocument/2006/relationships" xmlns:w="http://schemas.openxmlformats.org/wordprocessingml/2006/main" xmlns:w14="http://schemas.microsoft.com/office/word/2010/wordml" xmlns:w15="http://schemas.microsoft.com/office/word/2012/wordml" xmlns:w16cex="http://schemas.microsoft.com/office/word/2018/wordml/cex" xmlns:w16cid="http://schemas.microsoft.com/office/word/2016/wordml/cid" xmlns:w16="http://schemas.microsoft.com/office/word/2018/wordml" xmlns:w16du="http://schemas.microsoft.com/office/word/2023/wordml/word16du" xmlns:w16sdtdh="http://schemas.microsoft.com/office/word/2020/wordml/sdtdatahash" xmlns:w16sdtfl="http://schemas.microsoft.com/office/word/2024/wordml/sdtformatlock" xmlns:w16se="http://schemas.microsoft.com/office/word/2015/wordml/symex" mc:Ignorable="w14 w15 w16se w16cid w16 w16cex w16sdtdh w16sdtfl w16du">
-  <w:font w:name="Calibri">
-    <w:panose1 w:val="020F0502020204030204"/>
-    <w:charset w:val="00"/>
-    <w:family w:val="swiss"/>
-    <w:pitch w:val="variable"/>
-    <w:sig w:usb0="E4002EFF" w:usb1="C200247B" w:usb2="00000009" w:usb3="00000000" w:csb0="000001FF" w:csb1="00000000"/>
-  </w:font>
-  <w:font w:name="Times New Roman">
-    <w:panose1 w:val="02020603050405020304"/>
-    <w:charset w:val="00"/>
-    <w:family w:val="roman"/>
-    <w:pitch w:val="variable"/>
-    <w:sig w:usb0="E0002EFF" w:usb1="C000785B" w:usb2="00000009" w:usb3="00000000" w:csb0="000001FF" w:csb1="00000000"/>
-  </w:font>
-  <w:font w:name="Calibri Light">
-    <w:panose1 w:val="020F0302020204030204"/>
-    <w:charset w:val="00"/>
-    <w:family w:val="swiss"/>
-    <w:pitch w:val="variable"/>
-    <w:sig w:usb0="E4002EFF" w:usb1="C200247B" w:usb2="00000009" w:usb3="00000000" w:csb0="000001FF" w:csb1="00000000"/>
-  </w:font>
-</w:fonts>
-</file>
-
-<file path=word/glossary/settings.xml><?xml version="1.0" encoding="utf-8"?>
-<w:settings xmlns:mc="http://schemas.openxmlformats.org/markup-compatibility/2006" xmlns:o="urn:schemas-microsoft-com:office:office" xmlns:r="http://schemas.openxmlformats.org/officeDocument/2006/relationships" xmlns:m="http://schemas.openxmlformats.org/officeDocument/2006/math" xmlns:v="urn:schemas-microsoft-com:vml" xmlns:w10="urn:schemas-microsoft-com:office:word" xmlns:w="http://schemas.openxmlformats.org/wordprocessingml/2006/main" xmlns:w14="http://schemas.microsoft.com/office/word/2010/wordml" xmlns:w15="http://schemas.microsoft.com/office/word/2012/wordml" xmlns:w16cex="http://schemas.microsoft.com/office/word/2018/wordml/cex" xmlns:w16cid="http://schemas.microsoft.com/office/word/2016/wordml/cid" xmlns:w16="http://schemas.microsoft.com/office/word/2018/wordml" xmlns:w16du="http://schemas.microsoft.com/office/word/2023/wordml/word16du" xmlns:w16sdtdh="http://schemas.microsoft.com/office/word/2020/wordml/sdtdatahash" xmlns:w16sdtfl="http://schemas.microsoft.com/office/word/2024/wordml/sdtformatlock" xmlns:w16se="http://schemas.microsoft.com/office/word/2015/wordml/symex" xmlns:sl="http://schemas.openxmlformats.org/schemaLibrary/2006/main" mc:Ignorable="w14 w15 w16se w16cid w16 w16cex w16sdtdh w16sdtfl w16du">
-  <w:view w:val="normal"/>
-  <w:defaultTabStop w:val="720"/>
-  <w:characterSpacingControl w:val="doNotCompress"/>
-  <w:compat>
-    <w:useFELayout/>
-    <w:compatSetting w:name="compatibilityMode" w:uri="http://schemas.microsoft.com/office/word" w:val="15"/>
-    <w:compatSetting w:name="overrideTableStyleFontSizeAndJustification" w:uri="http://schemas.microsoft.com/office/word" w:val="1"/>
-    <w:compatSetting w:name="enableOpenTypeFeatures" w:uri="http://schemas.microsoft.com/office/word" w:val="1"/>
-    <w:compatSetting w:name="doNotFlipMirrorIndents" w:uri="http://schemas.microsoft.com/office/word" w:val="1"/>
-    <w:compatSetting w:name="differentiateMultirowTableHeaders" w:uri="http://schemas.microsoft.com/office/word" w:val="1"/>
-    <w:compatSetting w:name="useWord2013TrackBottomHyphenation" w:uri="http://schemas.microsoft.com/office/word" w:val="0"/>
-  </w:compat>
-  <w:rsids>
-    <w:rsidRoot w:val="00D25C54"/>
-    <w:rsid w:val="001B3BB6"/>
-    <w:rsid w:val="007304F3"/>
-    <w:rsid w:val="00995D18"/>
-    <w:rsid w:val="00C355CF"/>
-    <w:rsid w:val="00D25C54"/>
-    <w:rsid w:val="00FB3758"/>
-  </w:rsids>
-  <m:mathPr>
-    <m:mathFont m:val="Cambria Math"/>
-    <m:brkBin m:val="before"/>
-    <m:brkBinSub m:val="--"/>
-    <m:smallFrac m:val="0"/>
-    <m:dispDef/>
-    <m:lMargin m:val="0"/>
-    <m:rMargin m:val="0"/>
-    <m:defJc m:val="centerGroup"/>
-    <m:wrapIndent m:val="1440"/>
-    <m:intLim m:val="subSup"/>
-    <m:naryLim m:val="undOvr"/>
-  </m:mathPr>
-  <w:themeFontLang w:val="en-US"/>
-  <w:clrSchemeMapping w:bg1="light1" w:t1="dark1" w:bg2="light2" w:t2="dark2" w:accent1="accent1" w:accent2="accent2" w:accent3="accent3" w:accent4="accent4" w:accent5="accent5" w:accent6="accent6" w:hyperlink="hyperlink" w:followedHyperlink="followedHyperlink"/>
-  <w:decimalSymbol w:val="."/>
-  <w:listSeparator w:val=","/>
-  <w15:chartTrackingRefBased/>
-</w:settings>
-</file>
-
-<file path=word/glossary/styles.xml><?xml version="1.0" encoding="utf-8"?>
-<w:styles xmlns:mc="http://schemas.openxmlformats.org/markup-compatibility/2006" xmlns:r="http://schemas.openxmlformats.org/officeDocument/2006/relationships" xmlns:w="http://schemas.openxmlformats.org/wordprocessingml/2006/main" xmlns:w14="http://schemas.microsoft.com/office/word/2010/wordml" xmlns:w15="http://schemas.microsoft.com/office/word/2012/wordml" xmlns:w16cex="http://schemas.microsoft.com/office/word/2018/wordml/cex" xmlns:w16cid="http://schemas.microsoft.com/office/word/2016/wordml/cid" xmlns:w16="http://schemas.microsoft.com/office/word/2018/wordml" xmlns:w16du="http://schemas.microsoft.com/office/word/2023/wordml/word16du" xmlns:w16sdtdh="http://schemas.microsoft.com/office/word/2020/wordml/sdtdatahash" xmlns:w16sdtfl="http://schemas.microsoft.com/office/word/2024/wordml/sdtformatlock" xmlns:w16se="http://schemas.microsoft.com/office/word/2015/wordml/symex" mc:Ignorable="w14 w15 w16se w16cid w16 w16cex w16sdtdh w16sdtfl w16du">
-  <w:docDefaults>
-    <w:rPrDefault>
-      <w:rPr>
-        <w:rFonts w:asciiTheme="minorHAnsi" w:eastAsiaTheme="minorEastAsia" w:hAnsiTheme="minorHAnsi" w:cstheme="minorBidi"/>
-        <w:kern w:val="2"/>
-        <w:sz w:val="24"/>
-        <w:szCs w:val="24"/>
-        <w:lang w:val="en-US" w:eastAsia="en-US" w:bidi="ar-SA"/>
-        <w14:ligatures w14:val="standardContextual"/>
-      </w:rPr>
-    </w:rPrDefault>
-    <w:pPrDefault>
-      <w:pPr>
-        <w:spacing w:after="160" w:line="278" w:lineRule="auto"/>
-      </w:pPr>
-    </w:pPrDefault>
-  </w:docDefaults>
-  <w:latentStyles w:defLockedState="0" w:defUIPriority="99" w:defSemiHidden="0" w:defUnhideWhenUsed="0" w:defQFormat="0" w:count="376">
-    <w:lsdException w:name="Normal" w:uiPriority="0" w:qFormat="1"/>
-    <w:lsdException w:name="heading 1" w:uiPriority="9" w:qFormat="1"/>
-    <w:lsdException w:name="heading 2" w:semiHidden="1" w:uiPriority="9" w:unhideWhenUsed="1" w:qFormat="1"/>
-    <w:lsdException w:name="heading 3" w:semiHidden="1" w:uiPriority="9" w:unhideWhenUsed="1" w:qFormat="1"/>
-    <w:lsdException w:name="heading 4" w:semiHidden="1" w:uiPriority="9" w:unhideWhenUsed="1" w:qFormat="1"/>
-    <w:lsdException w:name="heading 5" w:semiHidden="1" w:uiPriority="9" w:unhideWhenUsed="1" w:qFormat="1"/>
-    <w:lsdException w:name="heading 6" w:semiHidden="1" w:uiPriority="9" w:unhideWhenUsed="1" w:qFormat="1"/>
-    <w:lsdException w:name="heading 7" w:semiHidden="1" w:uiPriority="9" w:unhideWhenUsed="1" w:qFormat="1"/>
-    <w:lsdException w:name="heading 8" w:semiHidden="1" w:uiPriority="9" w:unhideWhenUsed="1" w:qFormat="1"/>
-    <w:lsdException w:name="heading 9" w:semiHidden="1" w:uiPriority="9" w:unhideWhenUsed="1" w:qFormat="1"/>
-    <w:lsdException w:name="index 1" w:semiHidden="1" w:unhideWhenUsed="1"/>
-    <w:lsdException w:name="index 2" w:semiHidden="1" w:unhideWhenUsed="1"/>
-    <w:lsdException w:name="index 3" w:semiHidden="1" w:unhideWhenUsed="1"/>
-    <w:lsdException w:name="index 4" w:semiHidden="1" w:unhideWhenUsed="1"/>
-    <w:lsdException w:name="index 5" w:semiHidden="1" w:unhideWhenUsed="1"/>
-    <w:lsdException w:name="index 6" w:semiHidden="1" w:unhideWhenUsed="1"/>
-    <w:lsdException w:name="index 7" w:semiHidden="1" w:unhideWhenUsed="1"/>
-    <w:lsdException w:name="index 8" w:semiHidden="1" w:unhideWhenUsed="1"/>
-    <w:lsdException w:name="index 9" w:semiHidden="1" w:unhideWhenUsed="1"/>
-    <w:lsdException w:name="toc 1" w:semiHidden="1" w:uiPriority="39" w:unhideWhenUsed="1"/>
-    <w:lsdException w:name="toc 2" w:semiHidden="1" w:uiPriority="39" w:unhideWhenUsed="1"/>
-    <w:lsdException w:name="toc 3" w:semiHidden="1" w:uiPriority="39" w:unhideWhenUsed="1"/>
-    <w:lsdException w:name="toc 4" w:semiHidden="1" w:uiPriority="39" w:unhideWhenUsed="1"/>
-    <w:lsdException w:name="toc 5" w:semiHidden="1" w:uiPriority="39" w:unhideWhenUsed="1"/>
-    <w:lsdException w:name="toc 6" w:semiHidden="1" w:uiPriority="39" w:unhideWhenUsed="1"/>
-    <w:lsdException w:name="toc 7" w:semiHidden="1" w:uiPriority="39" w:unhideWhenUsed="1"/>
-    <w:lsdException w:name="toc 8" w:semiHidden="1" w:uiPriority="39" w:unhideWhenUsed="1"/>
-    <w:lsdException w:name="toc 9" w:semiHidden="1" w:uiPriority="39" w:unhideWhenUsed="1"/>
-    <w:lsdException w:name="Normal Indent" w:semiHidden="1" w:unhideWhenUsed="1"/>
-    <w:lsdException w:name="footnote text" w:semiHidden="1" w:unhideWhenUsed="1"/>
-    <w:lsdException w:name="annotation text" w:semiHidden="1" w:unhideWhenUsed="1"/>
-    <w:lsdException w:name="header" w:semiHidden="1" w:unhideWhenUsed="1"/>
-    <w:lsdException w:name="footer" w:semiHidden="1" w:unhideWhenUsed="1"/>
-    <w:lsdException w:name="index heading" w:semiHidden="1" w:unhideWhenUsed="1"/>
-    <w:lsdException w:name="caption" w:semiHidden="1" w:uiPriority="35" w:unhideWhenUsed="1" w:qFormat="1"/>
-    <w:lsdException w:name="table of figures" w:semiHidden="1" w:unhideWhenUsed="1"/>
-    <w:lsdException w:name="envelope address" w:semiHidden="1" w:unhideWhenUsed="1"/>
-    <w:lsdException w:name="envelope return" w:semiHidden="1" w:unhideWhenUsed="1"/>
-    <w:lsdException w:name="footnote reference" w:semiHidden="1" w:unhideWhenUsed="1"/>
-    <w:lsdException w:name="annotation reference" w:semiHidden="1" w:unhideWhenUsed="1"/>
-    <w:lsdException w:name="line number" w:semiHidden="1" w:unhideWhenUsed="1"/>
-    <w:lsdException w:name="page number" w:semiHidden="1" w:unhideWhenUsed="1"/>
-    <w:lsdException w:name="endnote reference" w:semiHidden="1" w:unhideWhenUsed="1"/>
-    <w:lsdException w:name="endnote text" w:semiHidden="1" w:unhideWhenUsed="1"/>
-    <w:lsdException w:name="table of authorities" w:semiHidden="1" w:unhideWhenUsed="1"/>
-    <w:lsdException w:name="macro" w:semiHidden="1" w:unhideWhenUsed="1"/>
-    <w:lsdException w:name="toa heading" w:semiHidden="1" w:unhideWhenUsed="1"/>
-    <w:lsdException w:name="List" w:semiHidden="1" w:unhideWhenUsed="1"/>
-    <w:lsdException w:name="List Bullet" w:semiHidden="1" w:unhideWhenUsed="1"/>
-    <w:lsdException w:name="List Number" w:semiHidden="1" w:unhideWhenUsed="1"/>
-    <w:lsdException w:name="List 2" w:semiHidden="1" w:unhideWhenUsed="1"/>
-    <w:lsdException w:name="List 3" w:semiHidden="1" w:unhideWhenUsed="1"/>
-    <w:lsdException w:name="List 4" w:semiHidden="1" w:unhideWhenUsed="1"/>
-    <w:lsdException w:name="List 5" w:semiHidden="1" w:unhideWhenUsed="1"/>
-    <w:lsdException w:name="List Bullet 2" w:semiHidden="1" w:unhideWhenUsed="1"/>
-    <w:lsdException w:name="List Bullet 3" w:semiHidden="1" w:unhideWhenUsed="1"/>
-    <w:lsdException w:name="List Bullet 4" w:semiHidden="1" w:unhideWhenUsed="1"/>
-    <w:lsdException w:name="List Bullet 5" w:semiHidden="1" w:unhideWhenUsed="1"/>
-    <w:lsdException w:name="List Number 2" w:semiHidden="1" w:unhideWhenUsed="1"/>
-    <w:lsdException w:name="List Number 3" w:semiHidden="1" w:unhideWhenUsed="1"/>
-    <w:lsdException w:name="List Number 4" w:semiHidden="1" w:unhideWhenUsed="1"/>
-    <w:lsdException w:name="List Number 5" w:semiHidden="1" w:unhideWhenUsed="1"/>
-    <w:lsdException w:name="Title" w:uiPriority="10" w:qFormat="1"/>
-    <w:lsdException w:name="Closing" w:semiHidden="1" w:unhideWhenUsed="1"/>
-    <w:lsdException w:name="Signature" w:semiHidden="1" w:unhideWhenUsed="1"/>
-    <w:lsdException w:name="Default Paragraph Font" w:semiHidden="1" w:uiPriority="1" w:unhideWhenUsed="1"/>
-    <w:lsdException w:name="Body Text" w:semiHidden="1" w:unhideWhenUsed="1"/>
-    <w:lsdException w:name="Body Text Indent" w:semiHidden="1" w:unhideWhenUsed="1"/>
-    <w:lsdException w:name="List Continue" w:semiHidden="1" w:unhideWhenUsed="1"/>
-    <w:lsdException w:name="List Continue 2" w:semiHidden="1" w:unhideWhenUsed="1"/>
-    <w:lsdException w:name="List Continue 3" w:semiHidden="1" w:unhideWhenUsed="1"/>
-    <w:lsdException w:name="List Continue 4" w:semiHidden="1" w:unhideWhenUsed="1"/>
-    <w:lsdException w:name="List Continue 5" w:semiHidden="1" w:unhideWhenUsed="1"/>
-    <w:lsdException w:name="Message Header" w:semiHidden="1" w:unhideWhenUsed="1"/>
-    <w:lsdException w:name="Subtitle" w:uiPriority="11" w:qFormat="1"/>
-    <w:lsdException w:name="Salutation" w:semiHidden="1" w:unhideWhenUsed="1"/>
-    <w:lsdException w:name="Date" w:semiHidden="1" w:unhideWhenUsed="1"/>
-    <w:lsdException w:name="Body Text First Indent" w:semiHidden="1" w:unhideWhenUsed="1"/>
-    <w:lsdException w:name="Body Text First Indent 2" w:semiHidden="1" w:unhideWhenUsed="1"/>
-    <w:lsdException w:name="Note Heading" w:semiHidden="1" w:unhideWhenUsed="1"/>
-    <w:lsdException w:name="Body Text 2" w:semiHidden="1" w:unhideWhenUsed="1"/>
-    <w:lsdException w:name="Body Text 3" w:semiHidden="1" w:unhideWhenUsed="1"/>
-    <w:lsdException w:name="Body Text Indent 2" w:semiHidden="1" w:unhideWhenUsed="1"/>
-    <w:lsdException w:name="Body Text Indent 3" w:semiHidden="1" w:unhideWhenUsed="1"/>
-    <w:lsdException w:name="Block Text" w:semiHidden="1" w:unhideWhenUsed="1"/>
-    <w:lsdException w:name="Hyperlink" w:semiHidden="1" w:unhideWhenUsed="1"/>
-    <w:lsdException w:name="FollowedHyperlink" w:semiHidden="1" w:unhideWhenUsed="1"/>
-    <w:lsdException w:name="Strong" w:uiPriority="22" w:qFormat="1"/>
-    <w:lsdException w:name="Emphasis" w:uiPriority="20" w:qFormat="1"/>
-    <w:lsdException w:name="Document Map" w:semiHidden="1" w:unhideWhenUsed="1"/>
-    <w:lsdException w:name="Plain Text" w:semiHidden="1" w:unhideWhenUsed="1"/>
-    <w:lsdException w:name="E-mail Signature" w:semiHidden="1" w:unhideWhenUsed="1"/>
-    <w:lsdException w:name="HTML Top of Form" w:semiHidden="1" w:unhideWhenUsed="1"/>
-    <w:lsdException w:name="HTML Bottom of Form" w:semiHidden="1" w:unhideWhenUsed="1"/>
-    <w:lsdException w:name="Normal (Web)" w:semiHidden="1" w:unhideWhenUsed="1"/>
-    <w:lsdException w:name="HTML Acronym" w:semiHidden="1" w:unhideWhenUsed="1"/>
-    <w:lsdException w:name="HTML Address" w:semiHidden="1" w:unhideWhenUsed="1"/>
-    <w:lsdException w:name="HTML Cite" w:semiHidden="1" w:unhideWhenUsed="1"/>
-    <w:lsdException w:name="HTML Code" w:semiHidden="1" w:unhideWhenUsed="1"/>
-    <w:lsdException w:name="HTML Definition" w:semiHidden="1" w:unhideWhenUsed="1"/>
-    <w:lsdException w:name="HTML Keyboard" w:semiHidden="1" w:unhideWhenUsed="1"/>
-    <w:lsdException w:name="HTML Preformatted" w:semiHidden="1" w:unhideWhenUsed="1"/>
-    <w:lsdException w:name="HTML Sample" w:semiHidden="1" w:unhideWhenUsed="1"/>
-    <w:lsdException w:name="HTML Typewriter" w:semiHidden="1" w:unhideWhenUsed="1"/>
-    <w:lsdException w:name="HTML Variable" w:semiHidden="1" w:unhideWhenUsed="1"/>
-    <w:lsdException w:name="Normal Table" w:semiHidden="1" w:unhideWhenUsed="1"/>
-    <w:lsdException w:name="annotation subject" w:semiHidden="1" w:unhideWhenUsed="1"/>
-    <w:lsdException w:name="No List" w:semiHidden="1" w:unhideWhenUsed="1"/>
-    <w:lsdException w:name="Outline List 1" w:semiHidden="1" w:unhideWhenUsed="1"/>
-    <w:lsdException w:name="Outline List 2" w:semiHidden="1" w:unhideWhenUsed="1"/>
-    <w:lsdException w:name="Outline List 3" w:semiHidden="1" w:unhideWhenUsed="1"/>
-    <w:lsdException w:name="Table Simple 1" w:semiHidden="1" w:unhideWhenUsed="1"/>
-    <w:lsdException w:name="Table Simple 2" w:semiHidden="1" w:unhideWhenUsed="1"/>
-    <w:lsdException w:name="Table Simple 3" w:semiHidden="1" w:unhideWhenUsed="1"/>
-    <w:lsdException w:name="Table Classic 1" w:semiHidden="1" w:unhideWhenUsed="1"/>
-    <w:lsdException w:name="Table Classic 2" w:semiHidden="1" w:unhideWhenUsed="1"/>
-    <w:lsdException w:name="Table Classic 3" w:semiHidden="1" w:unhideWhenUsed="1"/>
-    <w:lsdException w:name="Table Classic 4" w:semiHidden="1" w:unhideWhenUsed="1"/>
-    <w:lsdException w:name="Table Colorful 1" w:semiHidden="1" w:unhideWhenUsed="1"/>
-    <w:lsdException w:name="Table Colorful 2" w:semiHidden="1" w:unhideWhenUsed="1"/>
-    <w:lsdException w:name="Table Colorful 3" w:semiHidden="1" w:unhideWhenUsed="1"/>
-    <w:lsdException w:name="Table Columns 1" w:semiHidden="1" w:unhideWhenUsed="1"/>
-    <w:lsdException w:name="Table Columns 2" w:semiHidden="1" w:unhideWhenUsed="1"/>
-    <w:lsdException w:name="Table Columns 3" w:semiHidden="1" w:unhideWhenUsed="1"/>
-    <w:lsdException w:name="Table Columns 4" w:semiHidden="1" w:unhideWhenUsed="1"/>
-    <w:lsdException w:name="Table Columns 5" w:semiHidden="1" w:unhideWhenUsed="1"/>
-    <w:lsdException w:name="Table Grid 1" w:semiHidden="1" w:unhideWhenUsed="1"/>
-    <w:lsdException w:name="Table Grid 2" w:semiHidden="1" w:unhideWhenUsed="1"/>
-    <w:lsdException w:name="Table Grid 3" w:semiHidden="1" w:unhideWhenUsed="1"/>
-    <w:lsdException w:name="Table Grid 4" w:semiHidden="1" w:unhideWhenUsed="1"/>
-    <w:lsdException w:name="Table Grid 5" w:semiHidden="1" w:unhideWhenUsed="1"/>
-    <w:lsdException w:name="Table Grid 6" w:semiHidden="1" w:unhideWhenUsed="1"/>
-    <w:lsdException w:name="Table Grid 7" w:semiHidden="1" w:unhideWhenUsed="1"/>
-    <w:lsdException w:name="Table Grid 8" w:semiHidden="1" w:unhideWhenUsed="1"/>
-    <w:lsdException w:name="Table List 1" w:semiHidden="1" w:unhideWhenUsed="1"/>
-    <w:lsdException w:name="Table List 2" w:semiHidden="1" w:unhideWhenUsed="1"/>
-    <w:lsdException w:name="Table List 3" w:semiHidden="1" w:unhideWhenUsed="1"/>
-    <w:lsdException w:name="Table List 4" w:semiHidden="1" w:unhideWhenUsed="1"/>
-    <w:lsdException w:name="Table List 5" w:semiHidden="1" w:unhideWhenUsed="1"/>
-    <w:lsdException w:name="Table List 6" w:semiHidden="1" w:unhideWhenUsed="1"/>
-    <w:lsdException w:name="Table List 7" w:semiHidden="1" w:unhideWhenUsed="1"/>
-    <w:lsdException w:name="Table List 8" w:semiHidden="1" w:unhideWhenUsed="1"/>
-    <w:lsdException w:name="Table 3D effects 1" w:semiHidden="1" w:unhideWhenUsed="1"/>
-    <w:lsdException w:name="Table 3D effects 2" w:semiHidden="1" w:unhideWhenUsed="1"/>
-    <w:lsdException w:name="Table 3D effects 3" w:semiHidden="1" w:unhideWhenUsed="1"/>
-    <w:lsdException w:name="Table Contemporary" w:semiHidden="1" w:unhideWhenUsed="1"/>
-    <w:lsdException w:name="Table Elegant" w:semiHidden="1" w:unhideWhenUsed="1"/>
-    <w:lsdException w:name="Table Professional" w:semiHidden="1" w:unhideWhenUsed="1"/>
-    <w:lsdException w:name="Table Subtle 1" w:semiHidden="1" w:unhideWhenUsed="1"/>
-    <w:lsdException w:name="Table Subtle 2" w:semiHidden="1" w:unhideWhenUsed="1"/>
-    <w:lsdException w:name="Table Web 1" w:semiHidden="1" w:unhideWhenUsed="1"/>
-    <w:lsdException w:name="Table Web 2" w:semiHidden="1" w:unhideWhenUsed="1"/>
-    <w:lsdException w:name="Table Web 3" w:semiHidden="1" w:unhideWhenUsed="1"/>
-    <w:lsdException w:name="Balloon Text" w:semiHidden="1" w:unhideWhenUsed="1"/>
-    <w:lsdException w:name="Table Grid" w:uiPriority="39"/>
-    <w:lsdException w:name="Table Theme" w:semiHidden="1" w:unhideWhenUsed="1"/>
-    <w:lsdException w:name="Placeholder Text" w:semiHidden="1"/>
-    <w:lsdException w:name="No Spacing" w:uiPriority="1" w:qFormat="1"/>
-    <w:lsdException w:name="Light Shading" w:uiPriority="60"/>
-    <w:lsdException w:name="Light List" w:uiPriority="61"/>
-    <w:lsdException w:name="Light Grid" w:uiPriority="62"/>
-    <w:lsdException w:name="Medium Shading 1" w:uiPriority="63"/>
-    <w:lsdException w:name="Medium Shading 2" w:uiPriority="64"/>
-    <w:lsdException w:name="Medium List 1" w:uiPriority="65"/>
-    <w:lsdException w:name="Medium List 2" w:uiPriority="66"/>
-    <w:lsdException w:name="Medium Grid 1" w:uiPriority="67"/>
-    <w:lsdException w:name="Medium Grid 2" w:uiPriority="68"/>
-    <w:lsdException w:name="Medium Grid 3" w:uiPriority="69"/>
-    <w:lsdException w:name="Dark List" w:uiPriority="70"/>
-    <w:lsdException w:name="Colorful Shading" w:uiPriority="71"/>
-    <w:lsdException w:name="Colorful List" w:uiPriority="72"/>
-    <w:lsdException w:name="Colorful Grid" w:uiPriority="73"/>
-    <w:lsdException w:name="Light Shading Accent 1" w:uiPriority="60"/>
-    <w:lsdException w:name="Light List Accent 1" w:uiPriority="61"/>
-    <w:lsdException w:name="Light Grid Accent 1" w:uiPriority="62"/>
-    <w:lsdException w:name="Medium Shading 1 Accent 1" w:uiPriority="63"/>
-    <w:lsdException w:name="Medium Shading 2 Accent 1" w:uiPriority="64"/>
-    <w:lsdException w:name="Medium List 1 Accent 1" w:uiPriority="65"/>
-    <w:lsdException w:name="Revision" w:semiHidden="1"/>
-    <w:lsdException w:name="List Paragraph" w:uiPriority="34" w:qFormat="1"/>
-    <w:lsdException w:name="Quote" w:uiPriority="29" w:qFormat="1"/>
-    <w:lsdException w:name="Intense Quote" w:uiPriority="30" w:qFormat="1"/>
-    <w:lsdException w:name="Medium List 2 Accent 1" w:uiPriority="66"/>
-    <w:lsdException w:name="Medium Grid 1 Accent 1" w:uiPriority="67"/>
-    <w:lsdException w:name="Medium Grid 2 Accent 1" w:uiPriority="68"/>
-    <w:lsdException w:name="Medium Grid 3 Accent 1" w:uiPriority="69"/>
-    <w:lsdException w:name="Dark List Accent 1" w:uiPriority="70"/>
-    <w:lsdException w:name="Colorful Shading Accent 1" w:uiPriority="71"/>
-    <w:lsdException w:name="Colorful List Accent 1" w:uiPriority="72"/>
-    <w:lsdException w:name="Colorful Grid Accent 1" w:uiPriority="73"/>
-    <w:lsdException w:name="Light Shading Accent 2" w:uiPriority="60"/>
-    <w:lsdException w:name="Light List Accent 2" w:uiPriority="61"/>
-    <w:lsdException w:name="Light Grid Accent 2" w:uiPriority="62"/>
-    <w:lsdException w:name="Medium Shading 1 Accent 2" w:uiPriority="63"/>
-    <w:lsdException w:name="Medium Shading 2 Accent 2" w:uiPriority="64"/>
-    <w:lsdException w:name="Medium List 1 Accent 2" w:uiPriority="65"/>
-    <w:lsdException w:name="Medium List 2 Accent 2" w:uiPriority="66"/>
-    <w:lsdException w:name="Medium Grid 1 Accent 2" w:uiPriority="67"/>
-    <w:lsdException w:name="Medium Grid 2 Accent 2" w:uiPriority="68"/>
-    <w:lsdException w:name="Medium Grid 3 Accent 2" w:uiPriority="69"/>
-    <w:lsdException w:name="Dark List Accent 2" w:uiPriority="70"/>
-    <w:lsdException w:name="Colorful Shading Accent 2" w:uiPriority="71"/>
-    <w:lsdException w:name="Colorful List Accent 2" w:uiPriority="72"/>
-    <w:lsdException w:name="Colorful Grid Accent 2" w:uiPriority="73"/>
-    <w:lsdException w:name="Light Shading Accent 3" w:uiPriority="60"/>
-    <w:lsdException w:name="Light List Accent 3" w:uiPriority="61"/>
-    <w:lsdException w:name="Light Grid Accent 3" w:uiPriority="62"/>
-    <w:lsdException w:name="Medium Shading 1 Accent 3" w:uiPriority="63"/>
-    <w:lsdException w:name="Medium Shading 2 Accent 3" w:uiPriority="64"/>
-    <w:lsdException w:name="Medium List 1 Accent 3" w:uiPriority="65"/>
-    <w:lsdException w:name="Medium List 2 Accent 3" w:uiPriority="66"/>
-    <w:lsdException w:name="Medium Grid 1 Accent 3" w:uiPriority="67"/>
-    <w:lsdException w:name="Medium Grid 2 Accent 3" w:uiPriority="68"/>
-    <w:lsdException w:name="Medium Grid 3 Accent 3" w:uiPriority="69"/>
-    <w:lsdException w:name="Dark List Accent 3" w:uiPriority="70"/>
-    <w:lsdException w:name="Colorful Shading Accent 3" w:uiPriority="71"/>
-    <w:lsdException w:name="Colorful List Accent 3" w:uiPriority="72"/>
-    <w:lsdException w:name="Colorful Grid Accent 3" w:uiPriority="73"/>
-    <w:lsdException w:name="Light Shading Accent 4" w:uiPriority="60"/>
-    <w:lsdException w:name="Light List Accent 4" w:uiPriority="61"/>
-    <w:lsdException w:name="Light Grid Accent 4" w:uiPriority="62"/>
-    <w:lsdException w:name="Medium Shading 1 Accent 4" w:uiPriority="63"/>
-    <w:lsdException w:name="Medium Shading 2 Accent 4" w:uiPriority="64"/>
-    <w:lsdException w:name="Medium List 1 Accent 4" w:uiPriority="65"/>
-    <w:lsdException w:name="Medium List 2 Accent 4" w:uiPriority="66"/>
-    <w:lsdException w:name="Medium Grid 1 Accent 4" w:uiPriority="67"/>
-    <w:lsdException w:name="Medium Grid 2 Accent 4" w:uiPriority="68"/>
-    <w:lsdException w:name="Medium Grid 3 Accent 4" w:uiPriority="69"/>
-    <w:lsdException w:name="Dark List Accent 4" w:uiPriority="70"/>
-    <w:lsdException w:name="Colorful Shading Accent 4" w:uiPriority="71"/>
-    <w:lsdException w:name="Colorful List Accent 4" w:uiPriority="72"/>
-    <w:lsdException w:name="Colorful Grid Accent 4" w:uiPriority="73"/>
-    <w:lsdException w:name="Light Shading Accent 5" w:uiPriority="60"/>
-    <w:lsdException w:name="Light List Accent 5" w:uiPriority="61"/>
-    <w:lsdException w:name="Light Grid Accent 5" w:uiPriority="62"/>
-    <w:lsdException w:name="Medium Shading 1 Accent 5" w:uiPriority="63"/>
-    <w:lsdException w:name="Medium Shading 2 Accent 5" w:uiPriority="64"/>
-    <w:lsdException w:name="Medium List 1 Accent 5" w:uiPriority="65"/>
-    <w:lsdException w:name="Medium List 2 Accent 5" w:uiPriority="66"/>
-    <w:lsdException w:name="Medium Grid 1 Accent 5" w:uiPriority="67"/>
-    <w:lsdException w:name="Medium Grid 2 Accent 5" w:uiPriority="68"/>
-    <w:lsdException w:name="Medium Grid 3 Accent 5" w:uiPriority="69"/>
-    <w:lsdException w:name="Dark List Accent 5" w:uiPriority="70"/>
-    <w:lsdException w:name="Colorful Shading Accent 5" w:uiPriority="71"/>
-    <w:lsdException w:name="Colorful List Accent 5" w:uiPriority="72"/>
-    <w:lsdException w:name="Colorful Grid Accent 5" w:uiPriority="73"/>
-    <w:lsdException w:name="Light Shading Accent 6" w:uiPriority="60"/>
-    <w:lsdException w:name="Light List Accent 6" w:uiPriority="61"/>
-    <w:lsdException w:name="Light Grid Accent 6" w:uiPriority="62"/>
-    <w:lsdException w:name="Medium Shading 1 Accent 6" w:uiPriority="63"/>
-    <w:lsdException w:name="Medium Shading 2 Accent 6" w:uiPriority="64"/>
-    <w:lsdException w:name="Medium List 1 Accent 6" w:uiPriority="65"/>
-    <w:lsdException w:name="Medium List 2 Accent 6" w:uiPriority="66"/>
-    <w:lsdException w:name="Medium Grid 1 Accent 6" w:uiPriority="67"/>
-    <w:lsdException w:name="Medium Grid 2 Accent 6" w:uiPriority="68"/>
-    <w:lsdException w:name="Medium Grid 3 Accent 6" w:uiPriority="69"/>
-    <w:lsdException w:name="Dark List Accent 6" w:uiPriority="70"/>
-    <w:lsdException w:name="Colorful Shading Accent 6" w:uiPriority="71"/>
-    <w:lsdException w:name="Colorful List Accent 6" w:uiPriority="72"/>
-    <w:lsdException w:name="Colorful Grid Accent 6" w:uiPriority="73"/>
-    <w:lsdException w:name="Subtle Emphasis" w:uiPriority="19" w:qFormat="1"/>
-    <w:lsdException w:name="Intense Emphasis" w:uiPriority="21" w:qFormat="1"/>
-    <w:lsdException w:name="Subtle Reference" w:uiPriority="31" w:qFormat="1"/>
-    <w:lsdException w:name="Intense Reference" w:uiPriority="32" w:qFormat="1"/>
-    <w:lsdException w:name="Book Title" w:uiPriority="33" w:qFormat="1"/>
-    <w:lsdException w:name="Bibliography" w:semiHidden="1" w:uiPriority="37" w:unhideWhenUsed="1"/>
-    <w:lsdException w:name="TOC Heading" w:semiHidden="1" w:uiPriority="39" w:unhideWhenUsed="1" w:qFormat="1"/>
-    <w:lsdException w:name="Plain Table 1" w:uiPriority="41"/>
-    <w:lsdException w:name="Plain Table 2" w:uiPriority="42"/>
-    <w:lsdException w:name="Plain Table 3" w:uiPriority="43"/>
-    <w:lsdException w:name="Plain Table 4" w:uiPriority="44"/>
-    <w:lsdException w:name="Plain Table 5" w:uiPriority="45"/>
-    <w:lsdException w:name="Grid Table Light" w:uiPriority="40"/>
-    <w:lsdException w:name="Grid Table 1 Light" w:uiPriority="46"/>
-    <w:lsdException w:name="Grid Table 2" w:uiPriority="47"/>
-    <w:lsdException w:name="Grid Table 3" w:uiPriority="48"/>
-    <w:lsdException w:name="Grid Table 4" w:uiPriority="49"/>
-    <w:lsdException w:name="Grid Table 5 Dark" w:uiPriority="50"/>
-    <w:lsdException w:name="Grid Table 6 Colorful" w:uiPriority="51"/>
-    <w:lsdException w:name="Grid Table 7 Colorful" w:uiPriority="52"/>
-    <w:lsdException w:name="Grid Table 1 Light Accent 1" w:uiPriority="46"/>
-    <w:lsdException w:name="Grid Table 2 Accent 1" w:uiPriority="47"/>
-    <w:lsdException w:name="Grid Table 3 Accent 1" w:uiPriority="48"/>
-    <w:lsdException w:name="Grid Table 4 Accent 1" w:uiPriority="49"/>
-    <w:lsdException w:name="Grid Table 5 Dark Accent 1" w:uiPriority="50"/>
-    <w:lsdException w:name="Grid Table 6 Colorful Accent 1" w:uiPriority="51"/>
-    <w:lsdException w:name="Grid Table 7 Colorful Accent 1" w:uiPriority="52"/>
-    <w:lsdException w:name="Grid Table 1 Light Accent 2" w:uiPriority="46"/>
-    <w:lsdException w:name="Grid Table 2 Accent 2" w:uiPriority="47"/>
-    <w:lsdException w:name="Grid Table 3 Accent 2" w:uiPriority="48"/>
-    <w:lsdException w:name="Grid Table 4 Accent 2" w:uiPriority="49"/>
-    <w:lsdException w:name="Grid Table 5 Dark Accent 2" w:uiPriority="50"/>
-    <w:lsdException w:name="Grid Table 6 Colorful Accent 2" w:uiPriority="51"/>
-    <w:lsdException w:name="Grid Table 7 Colorful Accent 2" w:uiPriority="52"/>
-    <w:lsdException w:name="Grid Table 1 Light Accent 3" w:uiPriority="46"/>
-    <w:lsdException w:name="Grid Table 2 Accent 3" w:uiPriority="47"/>
-    <w:lsdException w:name="Grid Table 3 Accent 3" w:uiPriority="48"/>
-    <w:lsdException w:name="Grid Table 4 Accent 3" w:uiPriority="49"/>
-    <w:lsdException w:name="Grid Table 5 Dark Accent 3" w:uiPriority="50"/>
-    <w:lsdException w:name="Grid Table 6 Colorful Accent 3" w:uiPriority="51"/>
-    <w:lsdException w:name="Grid Table 7 Colorful Accent 3" w:uiPriority="52"/>
-    <w:lsdException w:name="Grid Table 1 Light Accent 4" w:uiPriority="46"/>
-    <w:lsdException w:name="Grid Table 2 Accent 4" w:uiPriority="47"/>
-    <w:lsdException w:name="Grid Table 3 Accent 4" w:uiPriority="48"/>
-    <w:lsdException w:name="Grid Table 4 Accent 4" w:uiPriority="49"/>
-    <w:lsdException w:name="Grid Table 5 Dark Accent 4" w:uiPriority="50"/>
-    <w:lsdException w:name="Grid Table 6 Colorful Accent 4" w:uiPriority="51"/>
-    <w:lsdException w:name="Grid Table 7 Colorful Accent 4" w:uiPriority="52"/>
-    <w:lsdException w:name="Grid Table 1 Light Accent 5" w:uiPriority="46"/>
-    <w:lsdException w:name="Grid Table 2 Accent 5" w:uiPriority="47"/>
-    <w:lsdException w:name="Grid Table 3 Accent 5" w:uiPriority="48"/>
-    <w:lsdException w:name="Grid Table 4 Accent 5" w:uiPriority="49"/>
-    <w:lsdException w:name="Grid Table 5 Dark Accent 5" w:uiPriority="50"/>
-    <w:lsdException w:name="Grid Table 6 Colorful Accent 5" w:uiPriority="51"/>
-    <w:lsdException w:name="Grid Table 7 Colorful Accent 5" w:uiPriority="52"/>
-    <w:lsdException w:name="Grid Table 1 Light Accent 6" w:uiPriority="46"/>
-    <w:lsdException w:name="Grid Table 2 Accent 6" w:uiPriority="47"/>
-    <w:lsdException w:name="Grid Table 3 Accent 6" w:uiPriority="48"/>
-    <w:lsdException w:name="Grid Table 4 Accent 6" w:uiPriority="49"/>
-    <w:lsdException w:name="Grid Table 5 Dark Accent 6" w:uiPriority="50"/>
-    <w:lsdException w:name="Grid Table 6 Colorful Accent 6" w:uiPriority="51"/>
-    <w:lsdException w:name="Grid Table 7 Colorful Accent 6" w:uiPriority="52"/>
-    <w:lsdException w:name="List Table 1 Light" w:uiPriority="46"/>
-    <w:lsdException w:name="List Table 2" w:uiPriority="47"/>
-    <w:lsdException w:name="List Table 3" w:uiPriority="48"/>
-    <w:lsdException w:name="List Table 4" w:uiPriority="49"/>
-    <w:lsdException w:name="List Table 5 Dark" w:uiPriority="50"/>
-    <w:lsdException w:name="List Table 6 Colorful" w:uiPriority="51"/>
-    <w:lsdException w:name="List Table 7 Colorful" w:uiPriority="52"/>
-    <w:lsdException w:name="List Table 1 Light Accent 1" w:uiPriority="46"/>
-    <w:lsdException w:name="List Table 2 Accent 1" w:uiPriority="47"/>
-    <w:lsdException w:name="List Table 3 Accent 1" w:uiPriority="48"/>
-    <w:lsdException w:name="List Table 4 Accent 1" w:uiPriority="49"/>
-    <w:lsdException w:name="List Table 5 Dark Accent 1" w:uiPriority="50"/>
-    <w:lsdException w:name="List Table 6 Colorful Accent 1" w:uiPriority="51"/>
-    <w:lsdException w:name="List Table 7 Colorful Accent 1" w:uiPriority="52"/>
-    <w:lsdException w:name="List Table 1 Light Accent 2" w:uiPriority="46"/>
-    <w:lsdException w:name="List Table 2 Accent 2" w:uiPriority="47"/>
-    <w:lsdException w:name="List Table 3 Accent 2" w:uiPriority="48"/>
-    <w:lsdException w:name="List Table 4 Accent 2" w:uiPriority="49"/>
-    <w:lsdException w:name="List Table 5 Dark Accent 2" w:uiPriority="50"/>
-    <w:lsdException w:name="List Table 6 Colorful Accent 2" w:uiPriority="51"/>
-    <w:lsdException w:name="List Table 7 Colorful Accent 2" w:uiPriority="52"/>
-    <w:lsdException w:name="List Table 1 Light Accent 3" w:uiPriority="46"/>
-    <w:lsdException w:name="List Table 2 Accent 3" w:uiPriority="47"/>
-    <w:lsdException w:name="List Table 3 Accent 3" w:uiPriority="48"/>
-    <w:lsdException w:name="List Table 4 Accent 3" w:uiPriority="49"/>
-    <w:lsdException w:name="List Table 5 Dark Accent 3" w:uiPriority="50"/>
-    <w:lsdException w:name="List Table 6 Colorful Accent 3" w:uiPriority="51"/>
-    <w:lsdException w:name="List Table 7 Colorful Accent 3" w:uiPriority="52"/>
-    <w:lsdException w:name="List Table 1 Light Accent 4" w:uiPriority="46"/>
-    <w:lsdException w:name="List Table 2 Accent 4" w:uiPriority="47"/>
-    <w:lsdException w:name="List Table 3 Accent 4" w:uiPriority="48"/>
-    <w:lsdException w:name="List Table 4 Accent 4" w:uiPriority="49"/>
-    <w:lsdException w:name="List Table 5 Dark Accent 4" w:uiPriority="50"/>
-    <w:lsdException w:name="List Table 6 Colorful Accent 4" w:uiPriority="51"/>
-    <w:lsdException w:name="List Table 7 Colorful Accent 4" w:uiPriority="52"/>
-    <w:lsdException w:name="List Table 1 Light Accent 5" w:uiPriority="46"/>
-    <w:lsdException w:name="List Table 2 Accent 5" w:uiPriority="47"/>
-    <w:lsdException w:name="List Table 3 Accent 5" w:uiPriority="48"/>
-    <w:lsdException w:name="List Table 4 Accent 5" w:uiPriority="49"/>
-    <w:lsdException w:name="List Table 5 Dark Accent 5" w:uiPriority="50"/>
-    <w:lsdException w:name="List Table 6 Colorful Accent 5" w:uiPriority="51"/>
-    <w:lsdException w:name="List Table 7 Colorful Accent 5" w:uiPriority="52"/>
-    <w:lsdException w:name="List Table 1 Light Accent 6" w:uiPriority="46"/>
-    <w:lsdException w:name="List Table 2 Accent 6" w:uiPriority="47"/>
-    <w:lsdException w:name="List Table 3 Accent 6" w:uiPriority="48"/>
-    <w:lsdException w:name="List Table 4 Accent 6" w:uiPriority="49"/>
-    <w:lsdException w:name="List Table 5 Dark Accent 6" w:uiPriority="50"/>
-    <w:lsdException w:name="List Table 6 Colorful Accent 6" w:uiPriority="51"/>
-    <w:lsdException w:name="List Table 7 Colorful Accent 6" w:uiPriority="52"/>
-    <w:lsdException w:name="Mention" w:semiHidden="1" w:unhideWhenUsed="1"/>
-    <w:lsdException w:name="Smart Hyperlink" w:semiHidden="1" w:unhideWhenUsed="1"/>
-    <w:lsdException w:name="Hashtag" w:semiHidden="1" w:unhideWhenUsed="1"/>
-    <w:lsdException w:name="Unresolved Mention" w:semiHidden="1" w:unhideWhenUsed="1"/>
-    <w:lsdException w:name="Smart Link" w:semiHidden="1" w:unhideWhenUsed="1"/>
-  </w:latentStyles>
-  <w:style w:type="paragraph" w:default="1" w:styleId="Normal">
-    <w:name w:val="Normal"/>
-    <w:qFormat/>
-  </w:style>
-  <w:style w:type="character" w:default="1" w:styleId="DefaultParagraphFont">
-    <w:name w:val="Default Paragraph Font"/>
-    <w:uiPriority w:val="1"/>
-    <w:semiHidden/>
-    <w:unhideWhenUsed/>
-  </w:style>
-  <w:style w:type="table" w:default="1" w:styleId="TableNormal">
-    <w:name w:val="Normal Table"/>
-    <w:uiPriority w:val="99"/>
-    <w:semiHidden/>
-    <w:unhideWhenUsed/>
-    <w:tblPr>
-      <w:tblInd w:w="0" w:type="dxa"/>
-      <w:tblCellMar>
-        <w:top w:w="0" w:type="dxa"/>
-        <w:left w:w="108" w:type="dxa"/>
-        <w:bottom w:w="0" w:type="dxa"/>
-        <w:right w:w="108" w:type="dxa"/>
-      </w:tblCellMar>
-    </w:tblPr>
-  </w:style>
-  <w:style w:type="numbering" w:default="1" w:styleId="NoList">
-    <w:name w:val="No List"/>
-    <w:uiPriority w:val="99"/>
-    <w:semiHidden/>
-    <w:unhideWhenUsed/>
-  </w:style>
-  <w:style w:type="character" w:styleId="PlaceholderText">
-    <w:name w:val="Placeholder Text"/>
-    <w:basedOn w:val="DefaultParagraphFont"/>
-    <w:uiPriority w:val="99"/>
-    <w:semiHidden/>
-    <w:rsid w:val="00D25C54"/>
-    <w:rPr>
-      <w:color w:val="666666"/>
-    </w:rPr>
-  </w:style>
-</w:styles>
-</file>
-
-<file path=word/glossary/webSettings.xml><?xml version="1.0" encoding="utf-8"?>
-<w:webSettings xmlns:mc="http://schemas.openxmlformats.org/markup-compatibility/2006" xmlns:r="http://schemas.openxmlformats.org/officeDocument/2006/relationships" xmlns:w="http://schemas.openxmlformats.org/wordprocessingml/2006/main" xmlns:w14="http://schemas.microsoft.com/office/word/2010/wordml" xmlns:w15="http://schemas.microsoft.com/office/word/2012/wordml" xmlns:w16cex="http://schemas.microsoft.com/office/word/2018/wordml/cex" xmlns:w16cid="http://schemas.microsoft.com/office/word/2016/wordml/cid" xmlns:w16="http://schemas.microsoft.com/office/word/2018/wordml" xmlns:w16du="http://schemas.microsoft.com/office/word/2023/wordml/word16du" xmlns:w16sdtdh="http://schemas.microsoft.com/office/word/2020/wordml/sdtdatahash" xmlns:w16sdtfl="http://schemas.microsoft.com/office/word/2024/wordml/sdtformatlock" xmlns:w16se="http://schemas.microsoft.com/office/word/2015/wordml/symex" mc:Ignorable="w14 w15 w16se w16cid w16 w16cex w16sdtdh w16sdtfl w16du">
-  <w:optimizeForBrowser/>
-  <w:allowPNG/>
-</w:webSettings>
-</file>
-
 <file path=word/theme/theme1.xml><?xml version="1.0" encoding="utf-8"?>
 <a:theme xmlns:a="http://schemas.openxmlformats.org/drawingml/2006/main" name="Office Theme">
   <a:themeElements>

</xml_diff>

<commit_message>
feat(template): enhance PHIẾU THU with additional placeholders for payer name, issue date, and cashier name
</commit_message>
<xml_diff>
--- a/BlueDental.BE/src/BlueDental.HttpApi.Host/wwwroot/templates/PHIẾU THU.docx
+++ b/BlueDental.BE/src/BlueDental.HttpApi.Host/wwwroot/templates/PHIẾU THU.docx
@@ -40,7 +40,7 @@
                 <w:noProof/>
               </w:rPr>
               <w:drawing>
-                <wp:inline distT="0" distB="0" distL="0" distR="0" wp14:anchorId="4BFF27C2" wp14:editId="2873507C">
+                <wp:inline distT="0" distB="0" distL="0" distR="0" wp14:anchorId="4BFF27C2" wp14:editId="3F29CD09">
                   <wp:extent cx="1294463" cy="1193800"/>
                   <wp:effectExtent l="0" t="0" r="1270" b="6350"/>
                   <wp:docPr id="1999780267" name="Picture 1"/>
@@ -204,8 +204,8 @@
         </w:tabs>
         <w:rPr>
           <w:rFonts w:ascii="Times New Roman" w:hAnsi="Times New Roman" w:cs="Times New Roman"/>
-          <w:sz w:val="4"/>
-          <w:szCs w:val="4"/>
+          <w:sz w:val="2"/>
+          <w:szCs w:val="2"/>
         </w:rPr>
       </w:pPr>
     </w:p>
@@ -755,8 +755,8 @@
         <w:rPr>
           <w:rFonts w:ascii="Times New Roman" w:hAnsi="Times New Roman" w:cs="Times New Roman"/>
           <w:kern w:val="0"/>
-          <w:sz w:val="12"/>
-          <w:szCs w:val="12"/>
+          <w:sz w:val="2"/>
+          <w:szCs w:val="2"/>
           <w14:ligatures w14:val="none"/>
         </w:rPr>
       </w:pPr>
@@ -932,6 +932,18 @@
               <w:rPr>
                 <w:rFonts w:ascii="Times New Roman" w:hAnsi="Times New Roman" w:cs="Times New Roman"/>
                 <w:kern w:val="0"/>
+                <w:lang w:val="vi-VN"/>
+                <w14:ligatures w14:val="none"/>
+              </w:rPr>
+            </w:pPr>
+          </w:p>
+          <w:p>
+            <w:pPr>
+              <w:jc w:val="center"/>
+              <w:rPr>
+                <w:rFonts w:ascii="Times New Roman" w:hAnsi="Times New Roman" w:cs="Times New Roman"/>
+                <w:kern w:val="0"/>
+                <w:lang w:val="vi-VN"/>
                 <w14:ligatures w14:val="none"/>
               </w:rPr>
             </w:pPr>
@@ -1058,6 +1070,18 @@
               <w:rPr>
                 <w:rFonts w:ascii="Times New Roman" w:hAnsi="Times New Roman" w:cs="Times New Roman"/>
                 <w:kern w:val="0"/>
+                <w:lang w:val="vi-VN"/>
+                <w14:ligatures w14:val="none"/>
+              </w:rPr>
+            </w:pPr>
+          </w:p>
+          <w:p>
+            <w:pPr>
+              <w:jc w:val="center"/>
+              <w:rPr>
+                <w:rFonts w:ascii="Times New Roman" w:hAnsi="Times New Roman" w:cs="Times New Roman"/>
+                <w:kern w:val="0"/>
+                <w:lang w:val="vi-VN"/>
                 <w14:ligatures w14:val="none"/>
               </w:rPr>
             </w:pPr>
@@ -1250,6 +1274,17 @@
               <w:rPr>
                 <w:rFonts w:ascii="Times New Roman" w:hAnsi="Times New Roman" w:cs="Times New Roman"/>
                 <w:kern w:val="0"/>
+                <w:lang w:val="vi-VN"/>
+                <w14:ligatures w14:val="none"/>
+              </w:rPr>
+            </w:pPr>
+          </w:p>
+          <w:p>
+            <w:pPr>
+              <w:jc w:val="center"/>
+              <w:rPr>
+                <w:rFonts w:ascii="Times New Roman" w:hAnsi="Times New Roman" w:cs="Times New Roman"/>
+                <w:kern w:val="0"/>
                 <w14:ligatures w14:val="none"/>
               </w:rPr>
             </w:pPr>
@@ -1313,6 +1348,9 @@
       <w:pPr>
         <w:rPr>
           <w:rFonts w:ascii="Times New Roman" w:hAnsi="Times New Roman" w:cs="Times New Roman"/>
+          <w:sz w:val="18"/>
+          <w:szCs w:val="18"/>
+          <w:lang w:val="vi-VN"/>
         </w:rPr>
       </w:pPr>
       <w:r>
@@ -1323,13 +1361,13 @@
         <mc:AlternateContent>
           <mc:Choice Requires="wps">
             <w:drawing>
-              <wp:anchor distT="0" distB="0" distL="114300" distR="114300" simplePos="0" relativeHeight="251659264" behindDoc="0" locked="0" layoutInCell="1" allowOverlap="1" wp14:anchorId="7A9F5E78" wp14:editId="41A1B1E0">
+              <wp:anchor distT="0" distB="0" distL="114300" distR="114300" simplePos="0" relativeHeight="251659264" behindDoc="0" locked="0" layoutInCell="1" allowOverlap="1" wp14:anchorId="7A9F5E78" wp14:editId="3B745504">
                 <wp:simplePos x="0" y="0"/>
                 <wp:positionH relativeFrom="column">
-                  <wp:posOffset>5180965</wp:posOffset>
+                  <wp:posOffset>5096313</wp:posOffset>
                 </wp:positionH>
                 <wp:positionV relativeFrom="paragraph">
-                  <wp:posOffset>290830</wp:posOffset>
+                  <wp:posOffset>174625</wp:posOffset>
                 </wp:positionV>
                 <wp:extent cx="755650" cy="755650"/>
                 <wp:effectExtent l="0" t="0" r="25400" b="25400"/>
@@ -1385,19 +1423,11 @@
           </mc:Choice>
           <mc:Fallback>
             <w:pict>
-              <v:rect w14:anchorId="52695D8D" id="Rectangle 1" o:spid="_x0000_s1026" style="position:absolute;margin-left:407.95pt;margin-top:22.9pt;width:59.5pt;height:59.5pt;z-index:251659264;visibility:visible;mso-wrap-style:square;mso-width-percent:0;mso-height-percent:0;mso-wrap-distance-left:9pt;mso-wrap-distance-top:0;mso-wrap-distance-right:9pt;mso-wrap-distance-bottom:0;mso-position-horizontal:absolute;mso-position-horizontal-relative:text;mso-position-vertical:absolute;mso-position-vertical-relative:text;mso-width-percent:0;mso-height-percent:0;mso-width-relative:margin;mso-height-relative:margin;v-text-anchor:middle" o:gfxdata="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" fillcolor="#4472c4 [3204]" strokecolor="#09101d [484]" strokeweight="1pt"/>
+              <v:rect w14:anchorId="503A0DC7" id="Rectangle 1" o:spid="_x0000_s1026" style="position:absolute;margin-left:401.3pt;margin-top:13.75pt;width:59.5pt;height:59.5pt;z-index:251659264;visibility:visible;mso-wrap-style:square;mso-width-percent:0;mso-height-percent:0;mso-wrap-distance-left:9pt;mso-wrap-distance-top:0;mso-wrap-distance-right:9pt;mso-wrap-distance-bottom:0;mso-position-horizontal:absolute;mso-position-horizontal-relative:text;mso-position-vertical:absolute;mso-position-vertical-relative:text;mso-width-percent:0;mso-height-percent:0;mso-width-relative:margin;mso-height-relative:margin;v-text-anchor:middle" o:gfxdata="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" fillcolor="#4472c4 [3204]" strokecolor="#09101d [484]" strokeweight="1pt"/>
             </w:pict>
           </mc:Fallback>
         </mc:AlternateContent>
       </w:r>
-    </w:p>
-    <w:p>
-      <w:pPr>
-        <w:jc w:val="center"/>
-        <w:rPr>
-          <w:rFonts w:ascii="Times New Roman" w:hAnsi="Times New Roman" w:cs="Times New Roman"/>
-        </w:rPr>
-      </w:pPr>
     </w:p>
     <w:sectPr>
       <w:footerReference w:type="default" r:id="rId7"/>
@@ -1440,6 +1470,7 @@
   <w:p>
     <w:pPr>
       <w:pStyle w:val="Footer"/>
+      <w:spacing w:line="360" w:lineRule="auto"/>
       <w:rPr>
         <w:rFonts w:ascii="Times New Roman" w:hAnsi="Times New Roman" w:cs="Times New Roman"/>
         <w:sz w:val="18"/>
@@ -1612,6 +1643,7 @@
   <w:p>
     <w:pPr>
       <w:pStyle w:val="Footer"/>
+      <w:spacing w:line="360" w:lineRule="auto"/>
       <w:rPr>
         <w:rFonts w:ascii="Times New Roman" w:hAnsi="Times New Roman" w:cs="Times New Roman"/>
         <w:sz w:val="18"/>

</xml_diff>